<commit_message>
Added answers (md file) for math exam topics 2025
</commit_message>
<xml_diff>
--- a/ideas/comments.docx
+++ b/ideas/comments.docx
@@ -250,6 +250,166 @@
           <w:lang w:val="el-GR"/>
         </w:rPr>
         <w:t>Ανοικτού τύπου</w:t>
+      </w:r>
+    </w:p>
+    <w:p>
+      <w:pPr>
+        <w:rPr>
+          <w:lang w:val="el-GR"/>
+        </w:rPr>
+      </w:pPr>
+    </w:p>
+    <w:p>
+      <w:pPr>
+        <w:pStyle w:val="Default"/>
+        <w:numPr>
+          <w:ilvl w:val="0"/>
+          <w:numId w:val="2"/>
+        </w:numPr>
+        <w:rPr>
+          <w:sz w:val="28"/>
+          <w:szCs w:val="28"/>
+          <w:lang w:val="el-GR"/>
+        </w:rPr>
+      </w:pPr>
+      <w:r>
+        <w:rPr>
+          <w:sz w:val="28"/>
+          <w:szCs w:val="28"/>
+          <w:lang w:val="el-GR"/>
+        </w:rPr>
+        <w:t xml:space="preserve">Για τα θέματα </w:t>
+      </w:r>
+      <w:r>
+        <w:rPr>
+          <w:b/>
+          <w:bCs/>
+          <w:sz w:val="28"/>
+          <w:szCs w:val="28"/>
+          <w:lang w:val="el-GR"/>
+        </w:rPr>
+        <w:t>Α1, Α2, Α3</w:t>
+      </w:r>
+      <w:r>
+        <w:rPr>
+          <w:sz w:val="28"/>
+          <w:szCs w:val="28"/>
+          <w:lang w:val="el-GR"/>
+        </w:rPr>
+        <w:t xml:space="preserve"> των Μαθηματικών ΓΕΛ 2025, δε δίνονται απαντήσεις από τον ΟΕΦΕ παρά μόνο η παραπομπή στο σχολικό εγχειρίδιο (</w:t>
+      </w:r>
+      <w:r>
+        <w:rPr>
+          <w:i/>
+          <w:iCs/>
+          <w:sz w:val="28"/>
+          <w:szCs w:val="28"/>
+          <w:lang w:val="el-GR"/>
+        </w:rPr>
+        <w:t>Α1. Σχολικό σελίδα186</w:t>
+      </w:r>
+      <w:r>
+        <w:rPr>
+          <w:i/>
+          <w:iCs/>
+          <w:sz w:val="28"/>
+          <w:szCs w:val="28"/>
+          <w:lang w:val="el-GR"/>
+        </w:rPr>
+        <w:t xml:space="preserve">, </w:t>
+      </w:r>
+      <w:r>
+        <w:rPr>
+          <w:i/>
+          <w:iCs/>
+          <w:sz w:val="28"/>
+          <w:szCs w:val="28"/>
+          <w:lang w:val="el-GR"/>
+        </w:rPr>
+        <w:t>Α2. Σχολικό σελίδα 76</w:t>
+      </w:r>
+      <w:r>
+        <w:rPr>
+          <w:i/>
+          <w:iCs/>
+          <w:sz w:val="28"/>
+          <w:szCs w:val="28"/>
+          <w:lang w:val="el-GR"/>
+        </w:rPr>
+        <w:t xml:space="preserve">, </w:t>
+      </w:r>
+      <w:r>
+        <w:rPr>
+          <w:i/>
+          <w:iCs/>
+          <w:sz w:val="28"/>
+          <w:szCs w:val="28"/>
+          <w:lang w:val="el-GR"/>
+        </w:rPr>
+        <w:t>Α3. Σχολικό σελίδα 161</w:t>
+      </w:r>
+      <w:r>
+        <w:rPr>
+          <w:sz w:val="28"/>
+          <w:szCs w:val="28"/>
+          <w:lang w:val="el-GR"/>
+        </w:rPr>
+        <w:t>)</w:t>
+      </w:r>
+      <w:r>
+        <w:rPr>
+          <w:sz w:val="28"/>
+          <w:szCs w:val="28"/>
+          <w:lang w:val="el-GR"/>
+        </w:rPr>
+        <w:t xml:space="preserve">. Οι απαντήσεις που έχουν δοθεί στο αντίστοιχο </w:t>
+      </w:r>
+      <w:r>
+        <w:rPr>
+          <w:sz w:val="28"/>
+          <w:szCs w:val="28"/>
+        </w:rPr>
+        <w:t>md</w:t>
+      </w:r>
+      <w:r>
+        <w:rPr>
+          <w:sz w:val="28"/>
+          <w:szCs w:val="28"/>
+          <w:lang w:val="el-GR"/>
+        </w:rPr>
+        <w:t xml:space="preserve"> </w:t>
+      </w:r>
+      <w:r>
+        <w:rPr>
+          <w:sz w:val="28"/>
+          <w:szCs w:val="28"/>
+          <w:lang w:val="el-GR"/>
+        </w:rPr>
+        <w:t>αρχείο προέρχονται από το Φροντιστήριο Πουκαμισάς που έχουν τόσο τις παραπομπές στις σελίδες του σχολικού βιβλίου όσο και τις απαντήσεις τις ίδιες</w:t>
+      </w:r>
+      <w:r>
+        <w:rPr>
+          <w:sz w:val="28"/>
+          <w:szCs w:val="28"/>
+          <w:lang w:val="el-GR"/>
+        </w:rPr>
+        <w:t xml:space="preserve"> (</w:t>
+      </w:r>
+      <w:r>
+        <w:rPr>
+          <w:sz w:val="28"/>
+          <w:szCs w:val="28"/>
+          <w:lang w:val="el-GR"/>
+        </w:rPr>
+        <w:t>https://www.poukamisas.gr/wp-content/uploads/2025/06/apantiseis-poukamisas-mathimatika-gel.pdf</w:t>
+      </w:r>
+      <w:r>
+        <w:rPr>
+          <w:sz w:val="28"/>
+          <w:szCs w:val="28"/>
+          <w:lang w:val="el-GR"/>
+        </w:rPr>
+        <w:t>).</w:t>
       </w:r>
     </w:p>
     <w:sectPr>
@@ -376,8 +536,124 @@
       </w:rPr>
     </w:lvl>
   </w:abstractNum>
+  <w:abstractNum w:abstractNumId="1" w15:restartNumberingAfterBreak="0">
+    <w:nsid w:val="5BD83F2E"/>
+    <w:multiLevelType w:val="hybridMultilevel"/>
+    <w:tmpl w:val="1F5ED18C"/>
+    <w:lvl w:ilvl="0" w:tplc="08090001">
+      <w:start w:val="1"/>
+      <w:numFmt w:val="bullet"/>
+      <w:lvlText w:val=""/>
+      <w:lvlJc w:val="left"/>
+      <w:pPr>
+        <w:ind w:left="720" w:hanging="360"/>
+      </w:pPr>
+      <w:rPr>
+        <w:rFonts w:ascii="Symbol" w:hAnsi="Symbol" w:hint="default"/>
+      </w:rPr>
+    </w:lvl>
+    <w:lvl w:ilvl="1" w:tplc="08090003" w:tentative="1">
+      <w:start w:val="1"/>
+      <w:numFmt w:val="bullet"/>
+      <w:lvlText w:val="o"/>
+      <w:lvlJc w:val="left"/>
+      <w:pPr>
+        <w:ind w:left="1440" w:hanging="360"/>
+      </w:pPr>
+      <w:rPr>
+        <w:rFonts w:ascii="Courier New" w:hAnsi="Courier New" w:cs="Courier New" w:hint="default"/>
+      </w:rPr>
+    </w:lvl>
+    <w:lvl w:ilvl="2" w:tplc="08090005" w:tentative="1">
+      <w:start w:val="1"/>
+      <w:numFmt w:val="bullet"/>
+      <w:lvlText w:val=""/>
+      <w:lvlJc w:val="left"/>
+      <w:pPr>
+        <w:ind w:left="2160" w:hanging="360"/>
+      </w:pPr>
+      <w:rPr>
+        <w:rFonts w:ascii="Wingdings" w:hAnsi="Wingdings" w:hint="default"/>
+      </w:rPr>
+    </w:lvl>
+    <w:lvl w:ilvl="3" w:tplc="08090001" w:tentative="1">
+      <w:start w:val="1"/>
+      <w:numFmt w:val="bullet"/>
+      <w:lvlText w:val=""/>
+      <w:lvlJc w:val="left"/>
+      <w:pPr>
+        <w:ind w:left="2880" w:hanging="360"/>
+      </w:pPr>
+      <w:rPr>
+        <w:rFonts w:ascii="Symbol" w:hAnsi="Symbol" w:hint="default"/>
+      </w:rPr>
+    </w:lvl>
+    <w:lvl w:ilvl="4" w:tplc="08090003" w:tentative="1">
+      <w:start w:val="1"/>
+      <w:numFmt w:val="bullet"/>
+      <w:lvlText w:val="o"/>
+      <w:lvlJc w:val="left"/>
+      <w:pPr>
+        <w:ind w:left="3600" w:hanging="360"/>
+      </w:pPr>
+      <w:rPr>
+        <w:rFonts w:ascii="Courier New" w:hAnsi="Courier New" w:cs="Courier New" w:hint="default"/>
+      </w:rPr>
+    </w:lvl>
+    <w:lvl w:ilvl="5" w:tplc="08090005" w:tentative="1">
+      <w:start w:val="1"/>
+      <w:numFmt w:val="bullet"/>
+      <w:lvlText w:val=""/>
+      <w:lvlJc w:val="left"/>
+      <w:pPr>
+        <w:ind w:left="4320" w:hanging="360"/>
+      </w:pPr>
+      <w:rPr>
+        <w:rFonts w:ascii="Wingdings" w:hAnsi="Wingdings" w:hint="default"/>
+      </w:rPr>
+    </w:lvl>
+    <w:lvl w:ilvl="6" w:tplc="08090001" w:tentative="1">
+      <w:start w:val="1"/>
+      <w:numFmt w:val="bullet"/>
+      <w:lvlText w:val=""/>
+      <w:lvlJc w:val="left"/>
+      <w:pPr>
+        <w:ind w:left="5040" w:hanging="360"/>
+      </w:pPr>
+      <w:rPr>
+        <w:rFonts w:ascii="Symbol" w:hAnsi="Symbol" w:hint="default"/>
+      </w:rPr>
+    </w:lvl>
+    <w:lvl w:ilvl="7" w:tplc="08090003" w:tentative="1">
+      <w:start w:val="1"/>
+      <w:numFmt w:val="bullet"/>
+      <w:lvlText w:val="o"/>
+      <w:lvlJc w:val="left"/>
+      <w:pPr>
+        <w:ind w:left="5760" w:hanging="360"/>
+      </w:pPr>
+      <w:rPr>
+        <w:rFonts w:ascii="Courier New" w:hAnsi="Courier New" w:cs="Courier New" w:hint="default"/>
+      </w:rPr>
+    </w:lvl>
+    <w:lvl w:ilvl="8" w:tplc="08090005" w:tentative="1">
+      <w:start w:val="1"/>
+      <w:numFmt w:val="bullet"/>
+      <w:lvlText w:val=""/>
+      <w:lvlJc w:val="left"/>
+      <w:pPr>
+        <w:ind w:left="6480" w:hanging="360"/>
+      </w:pPr>
+      <w:rPr>
+        <w:rFonts w:ascii="Wingdings" w:hAnsi="Wingdings" w:hint="default"/>
+      </w:rPr>
+    </w:lvl>
+  </w:abstractNum>
   <w:num w:numId="1">
     <w:abstractNumId w:val="0"/>
+  </w:num>
+  <w:num w:numId="2">
+    <w:abstractNumId w:val="1"/>
   </w:num>
 </w:numbering>
 </file>
@@ -819,6 +1095,22 @@
       <w:contextualSpacing/>
     </w:pPr>
   </w:style>
+  <w:style w:type="paragraph" w:customStyle="1" w:styleId="Default">
+    <w:name w:val="Default"/>
+    <w:rsid w:val="00503CF7"/>
+    <w:pPr>
+      <w:autoSpaceDE w:val="0"/>
+      <w:autoSpaceDN w:val="0"/>
+      <w:adjustRightInd w:val="0"/>
+      <w:spacing w:after="0" w:line="240" w:lineRule="auto"/>
+    </w:pPr>
+    <w:rPr>
+      <w:rFonts w:ascii="Times New Roman" w:hAnsi="Times New Roman" w:cs="Times New Roman"/>
+      <w:color w:val="000000"/>
+      <w:sz w:val="24"/>
+      <w:szCs w:val="24"/>
+    </w:rPr>
+  </w:style>
 </w:styles>
 </file>
 

</xml_diff>

<commit_message>
Added answers (md files) to all subjects (2025). Created json files for mathimatika and istoria exam topics 2024.
</commit_message>
<xml_diff>
--- a/ideas/comments.docx
+++ b/ideas/comments.docx
@@ -261,23 +261,144 @@
     </w:p>
     <w:p>
       <w:pPr>
+        <w:rPr>
+          <w:lang w:val="el-GR"/>
+        </w:rPr>
+      </w:pPr>
+    </w:p>
+    <w:p>
+      <w:pPr>
+        <w:rPr>
+          <w:lang w:val="el-GR"/>
+        </w:rPr>
+      </w:pPr>
+    </w:p>
+    <w:p>
+      <w:pPr>
+        <w:rPr>
+          <w:lang w:val="el-GR"/>
+        </w:rPr>
+      </w:pPr>
+    </w:p>
+    <w:p>
+      <w:pPr>
+        <w:rPr>
+          <w:lang w:val="el-GR"/>
+        </w:rPr>
+      </w:pPr>
+    </w:p>
+    <w:p>
+      <w:pPr>
+        <w:rPr>
+          <w:lang w:val="el-GR"/>
+        </w:rPr>
+      </w:pPr>
+    </w:p>
+    <w:p>
+      <w:pPr>
+        <w:rPr>
+          <w:lang w:val="el-GR"/>
+        </w:rPr>
+      </w:pPr>
+    </w:p>
+    <w:p>
+      <w:pPr>
+        <w:rPr>
+          <w:lang w:val="el-GR"/>
+        </w:rPr>
+      </w:pPr>
+    </w:p>
+    <w:p>
+      <w:pPr>
+        <w:rPr>
+          <w:lang w:val="el-GR"/>
+        </w:rPr>
+      </w:pPr>
+    </w:p>
+    <w:p>
+      <w:pPr>
+        <w:rPr>
+          <w:lang w:val="el-GR"/>
+        </w:rPr>
+      </w:pPr>
+    </w:p>
+    <w:p>
+      <w:pPr>
+        <w:rPr>
+          <w:lang w:val="el-GR"/>
+        </w:rPr>
+      </w:pPr>
+    </w:p>
+    <w:p>
+      <w:pPr>
+        <w:rPr>
+          <w:lang w:val="el-GR"/>
+        </w:rPr>
+      </w:pPr>
+    </w:p>
+    <w:p>
+      <w:pPr>
+        <w:rPr>
+          <w:lang w:val="el-GR"/>
+        </w:rPr>
+      </w:pPr>
+    </w:p>
+    <w:p>
+      <w:pPr>
+        <w:rPr>
+          <w:lang w:val="el-GR"/>
+        </w:rPr>
+      </w:pPr>
+    </w:p>
+    <w:p>
+      <w:pPr>
+        <w:rPr>
+          <w:lang w:val="el-GR"/>
+        </w:rPr>
+      </w:pPr>
+    </w:p>
+    <w:p>
+      <w:pPr>
+        <w:rPr>
+          <w:lang w:val="el-GR"/>
+        </w:rPr>
+      </w:pPr>
+    </w:p>
+    <w:p>
+      <w:pPr>
+        <w:rPr>
+          <w:lang w:val="el-GR"/>
+        </w:rPr>
+      </w:pPr>
+    </w:p>
+    <w:p>
+      <w:pPr>
+        <w:rPr>
+          <w:lang w:val="el-GR"/>
+        </w:rPr>
+      </w:pPr>
+    </w:p>
+    <w:p>
+      <w:pPr>
         <w:pStyle w:val="Default"/>
         <w:numPr>
           <w:ilvl w:val="0"/>
           <w:numId w:val="2"/>
         </w:numPr>
-        <w:rPr>
-          <w:sz w:val="28"/>
-          <w:szCs w:val="28"/>
-          <w:lang w:val="el-GR"/>
-        </w:rPr>
-      </w:pPr>
-      <w:r>
-        <w:rPr>
-          <w:sz w:val="28"/>
-          <w:szCs w:val="28"/>
-          <w:lang w:val="el-GR"/>
-        </w:rPr>
+        <w:jc w:val="both"/>
+        <w:rPr>
+          <w:sz w:val="28"/>
+          <w:szCs w:val="28"/>
+          <w:lang w:val="el-GR"/>
+        </w:rPr>
+      </w:pPr>
+      <w:r>
+        <w:rPr>
+          <w:sz w:val="28"/>
+          <w:szCs w:val="28"/>
+          <w:lang w:val="el-GR"/>
+        </w:rPr>
+        <w:lastRenderedPageBreak/>
         <w:t xml:space="preserve">Για τα θέματα </w:t>
       </w:r>
       <w:r>
@@ -306,12 +427,343 @@
           <w:szCs w:val="28"/>
           <w:lang w:val="el-GR"/>
         </w:rPr>
-        <w:t>Α1. Σχολικό σελίδα186</w:t>
-      </w:r>
-      <w:r>
-        <w:rPr>
-          <w:i/>
-          <w:iCs/>
+        <w:t>Α1. Σχολικό σελίδα186, Α2. Σχολικό σελίδα 76, Α3. Σχολικό σελίδα 161</w:t>
+      </w:r>
+      <w:r>
+        <w:rPr>
+          <w:sz w:val="28"/>
+          <w:szCs w:val="28"/>
+          <w:lang w:val="el-GR"/>
+        </w:rPr>
+        <w:t>)</w:t>
+      </w:r>
+      <w:r>
+        <w:rPr>
+          <w:sz w:val="28"/>
+          <w:szCs w:val="28"/>
+          <w:lang w:val="el-GR"/>
+        </w:rPr>
+        <w:t xml:space="preserve">. Οι απαντήσεις που έχουν δοθεί στο αντίστοιχο </w:t>
+      </w:r>
+      <w:r>
+        <w:rPr>
+          <w:sz w:val="28"/>
+          <w:szCs w:val="28"/>
+        </w:rPr>
+        <w:t>md</w:t>
+      </w:r>
+      <w:r>
+        <w:rPr>
+          <w:sz w:val="28"/>
+          <w:szCs w:val="28"/>
+          <w:lang w:val="el-GR"/>
+        </w:rPr>
+        <w:t xml:space="preserve"> </w:t>
+      </w:r>
+      <w:r>
+        <w:rPr>
+          <w:sz w:val="28"/>
+          <w:szCs w:val="28"/>
+          <w:lang w:val="el-GR"/>
+        </w:rPr>
+        <w:t>αρχείο προέρχονται από το Φροντιστήριο Πουκαμισάς που έχουν τόσο τις παραπομπές στις σελίδες του σχολικού βιβλίου όσο και τις απαντήσεις τις ίδιες</w:t>
+      </w:r>
+      <w:r>
+        <w:rPr>
+          <w:sz w:val="28"/>
+          <w:szCs w:val="28"/>
+          <w:lang w:val="el-GR"/>
+        </w:rPr>
+        <w:t xml:space="preserve"> (</w:t>
+      </w:r>
+      <w:hyperlink r:id="rId5" w:history="1">
+        <w:r>
+          <w:rPr>
+            <w:rStyle w:val="Hyperlink"/>
+            <w:sz w:val="28"/>
+            <w:szCs w:val="28"/>
+            <w:lang w:val="el-GR"/>
+          </w:rPr>
+          <w:t>https://www.poukamisas.gr/wp-content/uploads/2025/06/apantiseis-poukamisas-mathimatika-gel.pdf</w:t>
+        </w:r>
+      </w:hyperlink>
+      <w:r>
+        <w:rPr>
+          <w:sz w:val="28"/>
+          <w:szCs w:val="28"/>
+          <w:lang w:val="el-GR"/>
+        </w:rPr>
+        <w:t>).</w:t>
+      </w:r>
+    </w:p>
+    <w:p>
+      <w:pPr>
+        <w:pStyle w:val="Default"/>
+        <w:numPr>
+          <w:ilvl w:val="0"/>
+          <w:numId w:val="2"/>
+        </w:numPr>
+        <w:jc w:val="both"/>
+        <w:rPr>
+          <w:sz w:val="28"/>
+          <w:szCs w:val="28"/>
+          <w:lang w:val="el-GR"/>
+        </w:rPr>
+      </w:pPr>
+      <w:r>
+        <w:rPr>
+          <w:noProof/>
+          <w:sz w:val="28"/>
+          <w:szCs w:val="28"/>
+          <w:lang w:val="el-GR"/>
+        </w:rPr>
+        <mc:AlternateContent>
+          <mc:Choice Requires="wps">
+            <w:drawing>
+              <wp:anchor distT="0" distB="0" distL="114300" distR="114300" simplePos="0" relativeHeight="251660288" behindDoc="0" locked="0" layoutInCell="1" allowOverlap="1" wp14:anchorId="22B4C806" wp14:editId="7F2048BE">
+                <wp:simplePos x="0" y="0"/>
+                <wp:positionH relativeFrom="column">
+                  <wp:posOffset>-789410</wp:posOffset>
+                </wp:positionH>
+                <wp:positionV relativeFrom="paragraph">
+                  <wp:posOffset>29036</wp:posOffset>
+                </wp:positionV>
+                <wp:extent cx="947292" cy="736783"/>
+                <wp:effectExtent l="0" t="0" r="0" b="6350"/>
+                <wp:wrapNone/>
+                <wp:docPr id="2" name="Text Box 2"/>
+                <wp:cNvGraphicFramePr/>
+                <a:graphic xmlns:a="http://schemas.openxmlformats.org/drawingml/2006/main">
+                  <a:graphicData uri="http://schemas.microsoft.com/office/word/2010/wordprocessingShape">
+                    <wps:wsp>
+                      <wps:cNvSpPr txBox="1"/>
+                      <wps:spPr>
+                        <a:xfrm>
+                          <a:off x="0" y="0"/>
+                          <a:ext cx="947292" cy="736783"/>
+                        </a:xfrm>
+                        <a:prstGeom prst="rect">
+                          <a:avLst/>
+                        </a:prstGeom>
+                        <a:noFill/>
+                        <a:ln w="6350">
+                          <a:noFill/>
+                        </a:ln>
+                      </wps:spPr>
+                      <wps:txbx>
+                        <w:txbxContent>
+                          <w:p>
+                            <w:r>
+                              <w:t>To be investigated!</w:t>
+                            </w:r>
+                          </w:p>
+                        </w:txbxContent>
+                      </wps:txbx>
+                      <wps:bodyPr rot="0" spcFirstLastPara="0" vertOverflow="overflow" horzOverflow="overflow" vert="horz" wrap="square" lIns="91440" tIns="45720" rIns="91440" bIns="45720" numCol="1" spcCol="0" rtlCol="0" fromWordArt="0" anchor="t" anchorCtr="0" forceAA="0" compatLnSpc="1">
+                        <a:prstTxWarp prst="textNoShape">
+                          <a:avLst/>
+                        </a:prstTxWarp>
+                        <a:noAutofit/>
+                      </wps:bodyPr>
+                    </wps:wsp>
+                  </a:graphicData>
+                </a:graphic>
+                <wp14:sizeRelH relativeFrom="margin">
+                  <wp14:pctWidth>0</wp14:pctWidth>
+                </wp14:sizeRelH>
+              </wp:anchor>
+            </w:drawing>
+          </mc:Choice>
+          <mc:Fallback>
+            <w:pict>
+              <v:shapetype w14:anchorId="22B4C806" id="_x0000_t202" coordsize="21600,21600" o:spt="202" path="m,l,21600r21600,l21600,xe">
+                <v:stroke joinstyle="miter"/>
+                <v:path gradientshapeok="t" o:connecttype="rect"/>
+              </v:shapetype>
+              <v:shape id="Text Box 2" o:spid="_x0000_s1026" type="#_x0000_t202" style="position:absolute;left:0;text-align:left;margin-left:-62.15pt;margin-top:2.3pt;width:74.6pt;height:58pt;z-index:251660288;visibility:visible;mso-wrap-style:square;mso-width-percent:0;mso-wrap-distance-left:9pt;mso-wrap-distance-top:0;mso-wrap-distance-right:9pt;mso-wrap-distance-bottom:0;mso-position-horizontal:absolute;mso-position-horizontal-relative:text;mso-position-vertical:absolute;mso-position-vertical-relative:text;mso-width-percent:0;mso-width-relative:margin;v-text-anchor:top" o:gfxdata="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" filled="f" stroked="f" strokeweight=".5pt">
+                <v:textbox>
+                  <w:txbxContent>
+                    <w:p>
+                      <w:r>
+                        <w:t>To be investigated!</w:t>
+                      </w:r>
+                    </w:p>
+                  </w:txbxContent>
+                </v:textbox>
+              </v:shape>
+            </w:pict>
+          </mc:Fallback>
+        </mc:AlternateContent>
+      </w:r>
+      <w:r>
+        <w:rPr>
+          <w:noProof/>
+          <w:sz w:val="28"/>
+          <w:szCs w:val="28"/>
+          <w:lang w:val="el-GR"/>
+        </w:rPr>
+        <mc:AlternateContent>
+          <mc:Choice Requires="wps">
+            <w:drawing>
+              <wp:anchor distT="0" distB="0" distL="114300" distR="114300" simplePos="0" relativeHeight="251659264" behindDoc="0" locked="0" layoutInCell="1" allowOverlap="1" wp14:anchorId="5142B667" wp14:editId="5F10CFAD">
+                <wp:simplePos x="0" y="0"/>
+                <wp:positionH relativeFrom="column">
+                  <wp:posOffset>-789410</wp:posOffset>
+                </wp:positionH>
+                <wp:positionV relativeFrom="paragraph">
+                  <wp:posOffset>2723</wp:posOffset>
+                </wp:positionV>
+                <wp:extent cx="920978" cy="776253"/>
+                <wp:effectExtent l="0" t="0" r="0" b="5080"/>
+                <wp:wrapNone/>
+                <wp:docPr id="1" name="Rectangle: Folded Corner 1"/>
+                <wp:cNvGraphicFramePr/>
+                <a:graphic xmlns:a="http://schemas.openxmlformats.org/drawingml/2006/main">
+                  <a:graphicData uri="http://schemas.microsoft.com/office/word/2010/wordprocessingShape">
+                    <wps:wsp>
+                      <wps:cNvSpPr/>
+                      <wps:spPr>
+                        <a:xfrm>
+                          <a:off x="0" y="0"/>
+                          <a:ext cx="920978" cy="776253"/>
+                        </a:xfrm>
+                        <a:prstGeom prst="foldedCorner">
+                          <a:avLst/>
+                        </a:prstGeom>
+                        <a:solidFill>
+                          <a:schemeClr val="accent1">
+                            <a:lumMod val="40000"/>
+                            <a:lumOff val="60000"/>
+                          </a:schemeClr>
+                        </a:solidFill>
+                        <a:ln>
+                          <a:noFill/>
+                        </a:ln>
+                      </wps:spPr>
+                      <wps:style>
+                        <a:lnRef idx="2">
+                          <a:schemeClr val="accent1">
+                            <a:shade val="50000"/>
+                          </a:schemeClr>
+                        </a:lnRef>
+                        <a:fillRef idx="1">
+                          <a:schemeClr val="accent1"/>
+                        </a:fillRef>
+                        <a:effectRef idx="0">
+                          <a:schemeClr val="accent1"/>
+                        </a:effectRef>
+                        <a:fontRef idx="minor">
+                          <a:schemeClr val="lt1"/>
+                        </a:fontRef>
+                      </wps:style>
+                      <wps:bodyPr rot="0" spcFirstLastPara="0" vertOverflow="overflow" horzOverflow="overflow" vert="horz" wrap="square" lIns="91440" tIns="45720" rIns="91440" bIns="45720" numCol="1" spcCol="0" rtlCol="0" fromWordArt="0" anchor="ctr" anchorCtr="0" forceAA="0" compatLnSpc="1">
+                        <a:prstTxWarp prst="textNoShape">
+                          <a:avLst/>
+                        </a:prstTxWarp>
+                        <a:noAutofit/>
+                      </wps:bodyPr>
+                    </wps:wsp>
+                  </a:graphicData>
+                </a:graphic>
+              </wp:anchor>
+            </w:drawing>
+          </mc:Choice>
+          <mc:Fallback>
+            <w:pict>
+              <v:shapetype w14:anchorId="1ED75128" id="_x0000_t65" coordsize="21600,21600" o:spt="65" adj="18900" path="m,l,21600@0,21600,21600@0,21600,xem@0,21600nfl@3@5c@7@9@11@13,21600@0e">
+                <v:formulas>
+                  <v:f eqn="val #0"/>
+                  <v:f eqn="sum 21600 0 @0"/>
+                  <v:f eqn="prod @1 8481 32768"/>
+                  <v:f eqn="sum @2 @0 0"/>
+                  <v:f eqn="prod @1 1117 32768"/>
+                  <v:f eqn="sum @4 @0 0"/>
+                  <v:f eqn="prod @1 11764 32768"/>
+                  <v:f eqn="sum @6 @0 0"/>
+                  <v:f eqn="prod @1 6144 32768"/>
+                  <v:f eqn="sum @8 @0 0"/>
+                  <v:f eqn="prod @1 20480 32768"/>
+                  <v:f eqn="sum @10 @0 0"/>
+                  <v:f eqn="prod @1 6144 32768"/>
+                  <v:f eqn="sum @12 @0 0"/>
+                </v:formulas>
+                <v:path o:extrusionok="f" gradientshapeok="t" o:connecttype="rect" textboxrect="0,0,21600,@13"/>
+                <v:handles>
+                  <v:h position="#0,bottomRight" xrange="10800,21600"/>
+                </v:handles>
+                <o:complex v:ext="view"/>
+              </v:shapetype>
+              <v:shape id="Rectangle: Folded Corner 1" o:spid="_x0000_s1026" type="#_x0000_t65" style="position:absolute;margin-left:-62.15pt;margin-top:.2pt;width:72.5pt;height:61.1pt;z-index:251659264;visibility:visible;mso-wrap-style:square;mso-wrap-distance-left:9pt;mso-wrap-distance-top:0;mso-wrap-distance-right:9pt;mso-wrap-distance-bottom:0;mso-position-horizontal:absolute;mso-position-horizontal-relative:text;mso-position-vertical:absolute;mso-position-vertical-relative:text;v-text-anchor:middle" o:gfxdata="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" adj="18000" fillcolor="#b4c6e7 [1300]" stroked="f" strokeweight="1pt">
+                <v:stroke joinstyle="miter"/>
+              </v:shape>
+            </w:pict>
+          </mc:Fallback>
+        </mc:AlternateContent>
+      </w:r>
+      <w:r>
+        <w:rPr>
+          <w:sz w:val="28"/>
+          <w:szCs w:val="28"/>
+          <w:lang w:val="el-GR"/>
+        </w:rPr>
+        <w:t xml:space="preserve">Στις ερωτήσεις κλειστού τύπου στα θέματα Φυσικής 2025 </w:t>
+      </w:r>
+      <w:r>
+        <w:rPr>
+          <w:sz w:val="28"/>
+          <w:szCs w:val="28"/>
+          <w:lang w:val="el-GR"/>
+        </w:rPr>
+        <w:t xml:space="preserve">(Β1, Β3) </w:t>
+      </w:r>
+      <w:r>
+        <w:rPr>
+          <w:sz w:val="28"/>
+          <w:szCs w:val="28"/>
+          <w:lang w:val="el-GR"/>
+        </w:rPr>
+        <w:t xml:space="preserve">απαιτείται και αιτιολόγηση της απάντησης. Έτσι, </w:t>
+      </w:r>
+      <w:r>
+        <w:rPr>
+          <w:sz w:val="28"/>
+          <w:szCs w:val="28"/>
+          <w:lang w:val="el-GR"/>
+        </w:rPr>
+        <w:t xml:space="preserve">τα </w:t>
+      </w:r>
+      <w:r>
+        <w:rPr>
+          <w:sz w:val="28"/>
+          <w:szCs w:val="28"/>
+        </w:rPr>
+        <w:t>choices</w:t>
+      </w:r>
+      <w:r>
+        <w:rPr>
+          <w:sz w:val="28"/>
+          <w:szCs w:val="28"/>
+          <w:lang w:val="el-GR"/>
+        </w:rPr>
+        <w:t xml:space="preserve"> (</w:t>
+      </w:r>
+      <w:r>
+        <w:rPr>
+          <w:sz w:val="28"/>
+          <w:szCs w:val="28"/>
+          <w:lang w:val="el-GR"/>
+        </w:rPr>
+        <w:t xml:space="preserve">α, β, γ, </w:t>
+      </w:r>
+      <w:r>
+        <w:rPr>
+          <w:sz w:val="28"/>
+          <w:szCs w:val="28"/>
+        </w:rPr>
+        <w:t>i</w:t>
+      </w:r>
+      <w:r>
+        <w:rPr>
           <w:sz w:val="28"/>
           <w:szCs w:val="28"/>
           <w:lang w:val="el-GR"/>
@@ -320,56 +772,10 @@
       </w:r>
       <w:r>
         <w:rPr>
-          <w:i/>
-          <w:iCs/>
-          <w:sz w:val="28"/>
-          <w:szCs w:val="28"/>
-          <w:lang w:val="el-GR"/>
-        </w:rPr>
-        <w:t>Α2. Σχολικό σελίδα 76</w:t>
-      </w:r>
-      <w:r>
-        <w:rPr>
-          <w:i/>
-          <w:iCs/>
-          <w:sz w:val="28"/>
-          <w:szCs w:val="28"/>
-          <w:lang w:val="el-GR"/>
-        </w:rPr>
-        <w:t xml:space="preserve">, </w:t>
-      </w:r>
-      <w:r>
-        <w:rPr>
-          <w:i/>
-          <w:iCs/>
-          <w:sz w:val="28"/>
-          <w:szCs w:val="28"/>
-          <w:lang w:val="el-GR"/>
-        </w:rPr>
-        <w:t>Α3. Σχολικό σελίδα 161</w:t>
-      </w:r>
-      <w:r>
-        <w:rPr>
-          <w:sz w:val="28"/>
-          <w:szCs w:val="28"/>
-          <w:lang w:val="el-GR"/>
-        </w:rPr>
-        <w:t>)</w:t>
-      </w:r>
-      <w:r>
-        <w:rPr>
-          <w:sz w:val="28"/>
-          <w:szCs w:val="28"/>
-          <w:lang w:val="el-GR"/>
-        </w:rPr>
-        <w:t xml:space="preserve">. Οι απαντήσεις που έχουν δοθεί στο αντίστοιχο </w:t>
-      </w:r>
-      <w:r>
-        <w:rPr>
-          <w:sz w:val="28"/>
-          <w:szCs w:val="28"/>
-        </w:rPr>
-        <w:t>md</w:t>
+          <w:sz w:val="28"/>
+          <w:szCs w:val="28"/>
+        </w:rPr>
+        <w:t>ii</w:t>
       </w:r>
       <w:r>
         <w:rPr>
@@ -385,31 +791,85 @@
           <w:szCs w:val="28"/>
           <w:lang w:val="el-GR"/>
         </w:rPr>
-        <w:t>αρχείο προέρχονται από το Φροντιστήριο Πουκαμισάς που έχουν τόσο τις παραπομπές στις σελίδες του σχολικού βιβλίου όσο και τις απαντήσεις τις ίδιες</w:t>
-      </w:r>
-      <w:r>
-        <w:rPr>
-          <w:sz w:val="28"/>
-          <w:szCs w:val="28"/>
-          <w:lang w:val="el-GR"/>
-        </w:rPr>
-        <w:t xml:space="preserve"> (</w:t>
-      </w:r>
-      <w:r>
-        <w:rPr>
-          <w:sz w:val="28"/>
-          <w:szCs w:val="28"/>
-          <w:lang w:val="el-GR"/>
-        </w:rPr>
-        <w:t>https://www.poukamisas.gr/wp-content/uploads/2025/06/apantiseis-poukamisas-mathimatika-gel.pdf</w:t>
-      </w:r>
-      <w:r>
-        <w:rPr>
-          <w:sz w:val="28"/>
-          <w:szCs w:val="28"/>
-          <w:lang w:val="el-GR"/>
-        </w:rPr>
-        <w:t>).</w:t>
+        <w:t xml:space="preserve">κλπ) έχουν ενσωματωθεί στο </w:t>
+      </w:r>
+      <w:r>
+        <w:rPr>
+          <w:sz w:val="28"/>
+          <w:szCs w:val="28"/>
+        </w:rPr>
+        <w:t>question</w:t>
+      </w:r>
+      <w:r>
+        <w:rPr>
+          <w:sz w:val="28"/>
+          <w:szCs w:val="28"/>
+          <w:lang w:val="el-GR"/>
+        </w:rPr>
+        <w:t xml:space="preserve"> </w:t>
+      </w:r>
+      <w:r>
+        <w:rPr>
+          <w:sz w:val="28"/>
+          <w:szCs w:val="28"/>
+          <w:lang w:val="el-GR"/>
+        </w:rPr>
+        <w:t xml:space="preserve">και το πεδίο </w:t>
+      </w:r>
+      <w:r>
+        <w:rPr>
+          <w:sz w:val="28"/>
+          <w:szCs w:val="28"/>
+        </w:rPr>
+        <w:t>choices</w:t>
+      </w:r>
+      <w:r>
+        <w:rPr>
+          <w:sz w:val="28"/>
+          <w:szCs w:val="28"/>
+          <w:lang w:val="el-GR"/>
+        </w:rPr>
+        <w:t xml:space="preserve"> </w:t>
+      </w:r>
+      <w:r>
+        <w:rPr>
+          <w:sz w:val="28"/>
+          <w:szCs w:val="28"/>
+          <w:lang w:val="el-GR"/>
+        </w:rPr>
+        <w:t xml:space="preserve">είναι κενό </w:t>
+      </w:r>
+      <w:r>
+        <w:rPr>
+          <w:sz w:val="28"/>
+          <w:szCs w:val="28"/>
+          <w:lang w:val="el-GR"/>
+        </w:rPr>
+        <w:t xml:space="preserve">[] </w:t>
+      </w:r>
+      <w:r>
+        <w:rPr>
+          <w:sz w:val="28"/>
+          <w:szCs w:val="28"/>
+          <w:lang w:val="el-GR"/>
+        </w:rPr>
+        <w:t>για να μπορέσει να μαρκαριστεί η ερώτηση ως ανοιχτού τύπου</w:t>
+      </w:r>
+      <w:r>
+        <w:rPr>
+          <w:sz w:val="28"/>
+          <w:szCs w:val="28"/>
+          <w:lang w:val="el-GR"/>
+        </w:rPr>
+        <w:t>.</w:t>
+      </w:r>
+      <w:r>
+        <w:rPr>
+          <w:sz w:val="28"/>
+          <w:szCs w:val="28"/>
+          <w:lang w:val="el-GR"/>
+        </w:rPr>
+        <w:t xml:space="preserve"> </w:t>
       </w:r>
     </w:p>
     <w:sectPr>
@@ -1111,6 +1571,29 @@
       <w:szCs w:val="24"/>
     </w:rPr>
   </w:style>
+  <w:style w:type="character" w:styleId="Hyperlink">
+    <w:name w:val="Hyperlink"/>
+    <w:basedOn w:val="DefaultParagraphFont"/>
+    <w:uiPriority w:val="99"/>
+    <w:unhideWhenUsed/>
+    <w:rsid w:val="004E2BDC"/>
+    <w:rPr>
+      <w:color w:val="0563C1" w:themeColor="hyperlink"/>
+      <w:u w:val="single"/>
+    </w:rPr>
+  </w:style>
+  <w:style w:type="character" w:styleId="UnresolvedMention">
+    <w:name w:val="Unresolved Mention"/>
+    <w:basedOn w:val="DefaultParagraphFont"/>
+    <w:uiPriority w:val="99"/>
+    <w:semiHidden/>
+    <w:unhideWhenUsed/>
+    <w:rsid w:val="004E2BDC"/>
+    <w:rPr>
+      <w:color w:val="605E5C"/>
+      <w:shd w:val="clear" w:color="auto" w:fill="E1DFDD"/>
+    </w:rPr>
+  </w:style>
 </w:styles>
 </file>
 

</xml_diff>

<commit_message>
Added json file for the subject of pliroforiki 2024
</commit_message>
<xml_diff>
--- a/ideas/comments.docx
+++ b/ideas/comments.docx
@@ -706,15 +706,54 @@
           <w:szCs w:val="28"/>
           <w:lang w:val="el-GR"/>
         </w:rPr>
-        <w:t xml:space="preserve">Στις ερωτήσεις κλειστού τύπου στα θέματα Φυσικής 2025 </w:t>
-      </w:r>
-      <w:r>
-        <w:rPr>
-          <w:sz w:val="28"/>
-          <w:szCs w:val="28"/>
-          <w:lang w:val="el-GR"/>
-        </w:rPr>
-        <w:t xml:space="preserve">(Β1, Β3) </w:t>
+        <w:t>Στις ερωτήσεις κλειστού τύπου στα θέματα Φυσικής 2025</w:t>
+      </w:r>
+      <w:r>
+        <w:rPr>
+          <w:sz w:val="28"/>
+          <w:szCs w:val="28"/>
+          <w:lang w:val="el-GR"/>
+        </w:rPr>
+        <w:t>, 2024</w:t>
+      </w:r>
+      <w:r>
+        <w:rPr>
+          <w:sz w:val="28"/>
+          <w:szCs w:val="28"/>
+          <w:lang w:val="el-GR"/>
+        </w:rPr>
+        <w:t xml:space="preserve"> </w:t>
+      </w:r>
+      <w:r>
+        <w:rPr>
+          <w:sz w:val="28"/>
+          <w:szCs w:val="28"/>
+          <w:lang w:val="el-GR"/>
+        </w:rPr>
+        <w:t xml:space="preserve">(Β1, </w:t>
+      </w:r>
+      <w:r>
+        <w:rPr>
+          <w:sz w:val="28"/>
+          <w:szCs w:val="28"/>
+        </w:rPr>
+        <w:t>B</w:t>
+      </w:r>
+      <w:r>
+        <w:rPr>
+          <w:sz w:val="28"/>
+          <w:szCs w:val="28"/>
+          <w:lang w:val="el-GR"/>
+        </w:rPr>
+        <w:t xml:space="preserve">2, </w:t>
+      </w:r>
+      <w:r>
+        <w:rPr>
+          <w:sz w:val="28"/>
+          <w:szCs w:val="28"/>
+          <w:lang w:val="el-GR"/>
+        </w:rPr>
+        <w:t xml:space="preserve">Β3) </w:t>
       </w:r>
       <w:r>
         <w:rPr>

</xml_diff>

<commit_message>
Added json and md file for anatomia EPAL exam topic 2025
</commit_message>
<xml_diff>
--- a/ideas/comments.docx
+++ b/ideas/comments.docx
@@ -909,6 +909,83 @@
           <w:lang w:val="el-GR"/>
         </w:rPr>
         <w:t xml:space="preserve"> </w:t>
+      </w:r>
+    </w:p>
+    <w:p>
+      <w:pPr>
+        <w:pStyle w:val="Default"/>
+        <w:numPr>
+          <w:ilvl w:val="0"/>
+          <w:numId w:val="2"/>
+        </w:numPr>
+        <w:jc w:val="both"/>
+        <w:rPr>
+          <w:sz w:val="28"/>
+          <w:szCs w:val="28"/>
+          <w:lang w:val="el-GR"/>
+        </w:rPr>
+      </w:pPr>
+      <w:r>
+        <w:rPr>
+          <w:sz w:val="28"/>
+          <w:szCs w:val="28"/>
+          <w:lang w:val="el-GR"/>
+        </w:rPr>
+        <w:t>Στις απαντήσεις της Ανατομίας/Φυσιολογίας 2025 (ΕΠΑΛ) αναγράφονται και οι σελίδες του σχολικού εγχειριδίου στις οποίες εντοπίζονται οι σωστές απαντήσεις.</w:t>
+      </w:r>
+      <w:r>
+        <w:rPr>
+          <w:sz w:val="28"/>
+          <w:szCs w:val="28"/>
+          <w:lang w:val="el-GR"/>
+        </w:rPr>
+        <w:t xml:space="preserve"> Τις κρατάμε ως έχουν στα </w:t>
+      </w:r>
+      <w:r>
+        <w:rPr>
+          <w:sz w:val="28"/>
+          <w:szCs w:val="28"/>
+        </w:rPr>
+        <w:t>md</w:t>
+      </w:r>
+      <w:r>
+        <w:rPr>
+          <w:sz w:val="28"/>
+          <w:szCs w:val="28"/>
+          <w:lang w:val="el-GR"/>
+        </w:rPr>
+        <w:t xml:space="preserve"> </w:t>
+      </w:r>
+      <w:r>
+        <w:rPr>
+          <w:sz w:val="28"/>
+          <w:szCs w:val="28"/>
+        </w:rPr>
+        <w:t>files</w:t>
+      </w:r>
+      <w:r>
+        <w:rPr>
+          <w:sz w:val="28"/>
+          <w:szCs w:val="28"/>
+          <w:lang w:val="el-GR"/>
+        </w:rPr>
+        <w:t xml:space="preserve"> </w:t>
+      </w:r>
+      <w:r>
+        <w:rPr>
+          <w:sz w:val="28"/>
+          <w:szCs w:val="28"/>
+          <w:lang w:val="el-GR"/>
+        </w:rPr>
+        <w:t>ή τις αφαιρούμε</w:t>
+      </w:r>
+      <w:r>
+        <w:rPr>
+          <w:sz w:val="28"/>
+          <w:szCs w:val="28"/>
+          <w:lang w:val="el-GR"/>
+        </w:rPr>
+        <w:t>;</w:t>
       </w:r>
     </w:p>
     <w:sectPr>

</xml_diff>

<commit_message>
Added EPAL exam topics 2025
</commit_message>
<xml_diff>
--- a/ideas/comments.docx
+++ b/ideas/comments.docx
@@ -485,6 +485,82 @@
             <w:lang w:val="el-GR"/>
           </w:rPr>
           <w:t>https://www.poukamisas.gr/wp-content/uploads/2025/06/apantiseis-poukamisas-mathimatika-gel.pdf</w:t>
+        </w:r>
+      </w:hyperlink>
+      <w:r>
+        <w:rPr>
+          <w:sz w:val="28"/>
+          <w:szCs w:val="28"/>
+          <w:lang w:val="el-GR"/>
+        </w:rPr>
+        <w:t>).</w:t>
+      </w:r>
+    </w:p>
+    <w:p>
+      <w:pPr>
+        <w:pStyle w:val="Default"/>
+        <w:numPr>
+          <w:ilvl w:val="0"/>
+          <w:numId w:val="2"/>
+        </w:numPr>
+        <w:jc w:val="both"/>
+        <w:rPr>
+          <w:sz w:val="28"/>
+          <w:szCs w:val="28"/>
+          <w:lang w:val="el-GR"/>
+        </w:rPr>
+      </w:pPr>
+      <w:r>
+        <w:rPr>
+          <w:sz w:val="28"/>
+          <w:szCs w:val="28"/>
+          <w:lang w:val="el-GR"/>
+        </w:rPr>
+        <w:t xml:space="preserve">Το ίδιο ισχύει και για τα θέματα Μαθηματικών ΕΠΑΛ 2025 για τις ασκήσεις </w:t>
+      </w:r>
+      <w:r>
+        <w:rPr>
+          <w:b/>
+          <w:bCs/>
+          <w:sz w:val="28"/>
+          <w:szCs w:val="28"/>
+          <w:lang w:val="el-GR"/>
+        </w:rPr>
+        <w:t>Α1, Α2, Α4</w:t>
+      </w:r>
+      <w:r>
+        <w:rPr>
+          <w:sz w:val="28"/>
+          <w:szCs w:val="28"/>
+          <w:lang w:val="el-GR"/>
+        </w:rPr>
+        <w:t xml:space="preserve">. Οι απαντήσεις έχουν αντληθεί από το </w:t>
+      </w:r>
+      <w:r>
+        <w:rPr>
+          <w:sz w:val="28"/>
+          <w:szCs w:val="28"/>
+          <w:lang w:val="el-GR"/>
+        </w:rPr>
+        <w:t xml:space="preserve">Φροντιστήριο Πουκαμισάς </w:t>
+      </w:r>
+      <w:r>
+        <w:rPr>
+          <w:sz w:val="28"/>
+          <w:szCs w:val="28"/>
+          <w:lang w:val="el-GR"/>
+        </w:rPr>
+        <w:t>(</w:t>
+      </w:r>
+      <w:hyperlink r:id="rId6" w:history="1">
+        <w:r>
+          <w:rPr>
+            <w:rStyle w:val="Hyperlink"/>
+            <w:sz w:val="28"/>
+            <w:szCs w:val="28"/>
+            <w:lang w:val="el-GR"/>
+          </w:rPr>
+          <w:t>https://www.poukamisas.gr/wp-content/uploads/2025/06/apantiseis-poukamisas-mathimatika-epal.pdf</w:t>
         </w:r>
       </w:hyperlink>
       <w:r>

</xml_diff>

<commit_message>
Added answers (md files) for arxaia and istoria exam topics 2024
</commit_message>
<xml_diff>
--- a/ideas/comments.docx
+++ b/ideas/comments.docx
@@ -534,23 +534,7 @@
           <w:szCs w:val="28"/>
           <w:lang w:val="el-GR"/>
         </w:rPr>
-        <w:t xml:space="preserve">. Οι απαντήσεις έχουν αντληθεί από το </w:t>
-      </w:r>
-      <w:r>
-        <w:rPr>
-          <w:sz w:val="28"/>
-          <w:szCs w:val="28"/>
-          <w:lang w:val="el-GR"/>
-        </w:rPr>
-        <w:t xml:space="preserve">Φροντιστήριο Πουκαμισάς </w:t>
-      </w:r>
-      <w:r>
-        <w:rPr>
-          <w:sz w:val="28"/>
-          <w:szCs w:val="28"/>
-          <w:lang w:val="el-GR"/>
-        </w:rPr>
-        <w:t>(</w:t>
+        <w:t>. Οι απαντήσεις έχουν αντληθεί από το Φροντιστήριο Πουκαμισάς (</w:t>
       </w:r>
       <w:hyperlink r:id="rId6" w:history="1">
         <w:r>
@@ -570,6 +554,146 @@
           <w:lang w:val="el-GR"/>
         </w:rPr>
         <w:t>).</w:t>
+      </w:r>
+    </w:p>
+    <w:p>
+      <w:pPr>
+        <w:pStyle w:val="Default"/>
+        <w:numPr>
+          <w:ilvl w:val="0"/>
+          <w:numId w:val="2"/>
+        </w:numPr>
+        <w:jc w:val="both"/>
+        <w:rPr>
+          <w:sz w:val="28"/>
+          <w:szCs w:val="28"/>
+          <w:lang w:val="el-GR"/>
+        </w:rPr>
+      </w:pPr>
+      <w:r>
+        <w:rPr>
+          <w:sz w:val="28"/>
+          <w:szCs w:val="28"/>
+          <w:lang w:val="el-GR"/>
+        </w:rPr>
+        <w:t xml:space="preserve">Το ίδιο ισχύει </w:t>
+      </w:r>
+      <w:r>
+        <w:rPr>
+          <w:sz w:val="28"/>
+          <w:szCs w:val="28"/>
+          <w:lang w:val="el-GR"/>
+        </w:rPr>
+        <w:t xml:space="preserve">και για τα θέματα </w:t>
+      </w:r>
+      <w:r>
+        <w:rPr>
+          <w:sz w:val="28"/>
+          <w:szCs w:val="28"/>
+          <w:lang w:val="el-GR"/>
+        </w:rPr>
+        <w:t xml:space="preserve">Ιστορίας ΓΕΛ 2024 για τις ασκήσεις </w:t>
+      </w:r>
+      <w:r>
+        <w:rPr>
+          <w:b/>
+          <w:bCs/>
+          <w:sz w:val="28"/>
+          <w:szCs w:val="28"/>
+          <w:lang w:val="el-GR"/>
+        </w:rPr>
+        <w:t>Β1, Β2</w:t>
+      </w:r>
+      <w:r>
+        <w:rPr>
+          <w:sz w:val="28"/>
+          <w:szCs w:val="28"/>
+          <w:lang w:val="el-GR"/>
+        </w:rPr>
+        <w:t xml:space="preserve">. </w:t>
+      </w:r>
+      <w:r>
+        <w:rPr>
+          <w:sz w:val="28"/>
+          <w:szCs w:val="28"/>
+          <w:lang w:val="el-GR"/>
+        </w:rPr>
+        <w:t xml:space="preserve">Οι </w:t>
+      </w:r>
+      <w:r>
+        <w:rPr>
+          <w:sz w:val="28"/>
+          <w:szCs w:val="28"/>
+          <w:lang w:val="el-GR"/>
+        </w:rPr>
+        <w:t xml:space="preserve">ενδεικτικές </w:t>
+      </w:r>
+      <w:r>
+        <w:rPr>
+          <w:sz w:val="28"/>
+          <w:szCs w:val="28"/>
+          <w:lang w:val="el-GR"/>
+        </w:rPr>
+        <w:t xml:space="preserve">απαντήσεις έχουν αντληθεί από το Φροντιστήριο </w:t>
+      </w:r>
+      <w:r>
+        <w:rPr>
+          <w:sz w:val="28"/>
+          <w:szCs w:val="28"/>
+          <w:lang w:val="el-GR"/>
+        </w:rPr>
+        <w:t>ΔΙΑΚΡΟΤΗΜΑ (</w:t>
+      </w:r>
+      <w:hyperlink r:id="rId7" w:history="1">
+        <w:r>
+          <w:rPr>
+            <w:rStyle w:val="Hyperlink"/>
+            <w:sz w:val="28"/>
+            <w:szCs w:val="28"/>
+            <w:lang w:val="el-GR"/>
+          </w:rPr>
+          <w:t>https://www.panellinies.net/wp-content/uploads/2024/06/istoria_2024_ap13.pdf</w:t>
+        </w:r>
+      </w:hyperlink>
+      <w:r>
+        <w:rPr>
+          <w:sz w:val="28"/>
+          <w:szCs w:val="28"/>
+          <w:lang w:val="el-GR"/>
+        </w:rPr>
+        <w:t>)</w:t>
+      </w:r>
+      <w:r>
+        <w:rPr>
+          <w:sz w:val="28"/>
+          <w:szCs w:val="28"/>
+          <w:lang w:val="el-GR"/>
+        </w:rPr>
+        <w:t>,</w:t>
+      </w:r>
+      <w:r>
+        <w:rPr>
+          <w:sz w:val="28"/>
+          <w:szCs w:val="28"/>
+          <w:lang w:val="el-GR"/>
+        </w:rPr>
+        <w:t xml:space="preserve"> καθώς δεν υπήρχαν ούτε στο </w:t>
+      </w:r>
+      <w:r>
+        <w:rPr>
+          <w:sz w:val="28"/>
+          <w:szCs w:val="28"/>
+          <w:lang w:val="el-GR"/>
+        </w:rPr>
+        <w:t>Φροντιστήριο Πουκαμισάς</w:t>
+      </w:r>
+      <w:r>
+        <w:rPr>
+          <w:sz w:val="28"/>
+          <w:szCs w:val="28"/>
+          <w:lang w:val="el-GR"/>
+        </w:rPr>
+        <w:t>.</w:t>
       </w:r>
     </w:p>
     <w:p>

</xml_diff>

<commit_message>
Added answers (md files) for 2024 GEL fysiki and pliroforiki exam topics and 2023 GEL istoria exam topic.
</commit_message>
<xml_diff>
--- a/ideas/comments.docx
+++ b/ideas/comments.docx
@@ -576,23 +576,7 @@
           <w:szCs w:val="28"/>
           <w:lang w:val="el-GR"/>
         </w:rPr>
-        <w:t xml:space="preserve">Το ίδιο ισχύει </w:t>
-      </w:r>
-      <w:r>
-        <w:rPr>
-          <w:sz w:val="28"/>
-          <w:szCs w:val="28"/>
-          <w:lang w:val="el-GR"/>
-        </w:rPr>
-        <w:t xml:space="preserve">και για τα θέματα </w:t>
-      </w:r>
-      <w:r>
-        <w:rPr>
-          <w:sz w:val="28"/>
-          <w:szCs w:val="28"/>
-          <w:lang w:val="el-GR"/>
-        </w:rPr>
-        <w:t xml:space="preserve">Ιστορίας ΓΕΛ 2024 για τις ασκήσεις </w:t>
+        <w:t xml:space="preserve">Το ίδιο ισχύει και για τα θέματα Ιστορίας ΓΕΛ 2024 για τις ασκήσεις </w:t>
       </w:r>
       <w:r>
         <w:rPr>
@@ -610,39 +594,7 @@
           <w:szCs w:val="28"/>
           <w:lang w:val="el-GR"/>
         </w:rPr>
-        <w:t xml:space="preserve">. </w:t>
-      </w:r>
-      <w:r>
-        <w:rPr>
-          <w:sz w:val="28"/>
-          <w:szCs w:val="28"/>
-          <w:lang w:val="el-GR"/>
-        </w:rPr>
-        <w:t xml:space="preserve">Οι </w:t>
-      </w:r>
-      <w:r>
-        <w:rPr>
-          <w:sz w:val="28"/>
-          <w:szCs w:val="28"/>
-          <w:lang w:val="el-GR"/>
-        </w:rPr>
-        <w:t xml:space="preserve">ενδεικτικές </w:t>
-      </w:r>
-      <w:r>
-        <w:rPr>
-          <w:sz w:val="28"/>
-          <w:szCs w:val="28"/>
-          <w:lang w:val="el-GR"/>
-        </w:rPr>
-        <w:t xml:space="preserve">απαντήσεις έχουν αντληθεί από το Φροντιστήριο </w:t>
-      </w:r>
-      <w:r>
-        <w:rPr>
-          <w:sz w:val="28"/>
-          <w:szCs w:val="28"/>
-          <w:lang w:val="el-GR"/>
-        </w:rPr>
-        <w:t>ΔΙΑΚΡΟΤΗΜΑ (</w:t>
+        <w:t>. Οι ενδεικτικές απαντήσεις έχουν αντληθεί από το Φροντιστήριο ΔΙΑΚΡΟΤΗΜΑ (</w:t>
       </w:r>
       <w:hyperlink r:id="rId7" w:history="1">
         <w:r>
@@ -677,23 +629,225 @@
           <w:szCs w:val="28"/>
           <w:lang w:val="el-GR"/>
         </w:rPr>
-        <w:t xml:space="preserve"> καθώς δεν υπήρχαν ούτε στο </w:t>
-      </w:r>
-      <w:r>
-        <w:rPr>
-          <w:sz w:val="28"/>
-          <w:szCs w:val="28"/>
-          <w:lang w:val="el-GR"/>
-        </w:rPr>
-        <w:t>Φροντιστήριο Πουκαμισάς</w:t>
-      </w:r>
-      <w:r>
-        <w:rPr>
-          <w:sz w:val="28"/>
-          <w:szCs w:val="28"/>
-          <w:lang w:val="el-GR"/>
-        </w:rPr>
-        <w:t>.</w:t>
+        <w:t xml:space="preserve"> καθώς δεν υπήρχαν ούτε στο Φροντιστήριο Πουκαμισάς.</w:t>
+      </w:r>
+    </w:p>
+    <w:p>
+      <w:pPr>
+        <w:pStyle w:val="Default"/>
+        <w:numPr>
+          <w:ilvl w:val="0"/>
+          <w:numId w:val="2"/>
+        </w:numPr>
+        <w:jc w:val="both"/>
+        <w:rPr>
+          <w:sz w:val="28"/>
+          <w:szCs w:val="28"/>
+          <w:lang w:val="el-GR"/>
+        </w:rPr>
+      </w:pPr>
+      <w:r>
+        <w:rPr>
+          <w:sz w:val="28"/>
+          <w:szCs w:val="28"/>
+          <w:lang w:val="el-GR"/>
+        </w:rPr>
+        <w:t xml:space="preserve">Το ίδιο ισχύει και για τα θέματα Μαθηματικών ΓΕΛ 2024 για τις ασκήσεις </w:t>
+      </w:r>
+      <w:r>
+        <w:rPr>
+          <w:b/>
+          <w:bCs/>
+          <w:sz w:val="28"/>
+          <w:szCs w:val="28"/>
+          <w:lang w:val="el-GR"/>
+        </w:rPr>
+        <w:t>Α1, Α2, Α</w:t>
+      </w:r>
+      <w:r>
+        <w:rPr>
+          <w:b/>
+          <w:bCs/>
+          <w:sz w:val="28"/>
+          <w:szCs w:val="28"/>
+          <w:lang w:val="el-GR"/>
+        </w:rPr>
+        <w:t>3</w:t>
+      </w:r>
+      <w:r>
+        <w:rPr>
+          <w:sz w:val="28"/>
+          <w:szCs w:val="28"/>
+          <w:lang w:val="el-GR"/>
+        </w:rPr>
+        <w:t xml:space="preserve">. Οι απαντήσεις έχουν αντληθεί από το </w:t>
+      </w:r>
+      <w:r>
+        <w:rPr>
+          <w:sz w:val="28"/>
+          <w:szCs w:val="28"/>
+          <w:lang w:val="el-GR"/>
+        </w:rPr>
+        <w:t>lisari.blogspot.com</w:t>
+      </w:r>
+      <w:r>
+        <w:rPr>
+          <w:sz w:val="28"/>
+          <w:szCs w:val="28"/>
+          <w:lang w:val="el-GR"/>
+        </w:rPr>
+        <w:t xml:space="preserve"> (</w:t>
+      </w:r>
+      <w:hyperlink r:id="rId8" w:history="1">
+        <w:r>
+          <w:rPr>
+            <w:rStyle w:val="Hyperlink"/>
+            <w:sz w:val="28"/>
+            <w:szCs w:val="28"/>
+            <w:lang w:val="el-GR"/>
+          </w:rPr>
+          <w:t>https://www.panellinies.net/wpcontent/uploads/2024/06/math_2024_ap113.pdf</w:t>
+        </w:r>
+      </w:hyperlink>
+      <w:r>
+        <w:rPr>
+          <w:sz w:val="28"/>
+          <w:szCs w:val="28"/>
+          <w:lang w:val="el-GR"/>
+        </w:rPr>
+        <w:t>)</w:t>
+      </w:r>
+    </w:p>
+    <w:p>
+      <w:pPr>
+        <w:pStyle w:val="Default"/>
+        <w:numPr>
+          <w:ilvl w:val="0"/>
+          <w:numId w:val="2"/>
+        </w:numPr>
+        <w:jc w:val="both"/>
+        <w:rPr>
+          <w:sz w:val="28"/>
+          <w:szCs w:val="28"/>
+          <w:lang w:val="el-GR"/>
+        </w:rPr>
+      </w:pPr>
+      <w:r>
+        <w:rPr>
+          <w:sz w:val="28"/>
+          <w:szCs w:val="28"/>
+          <w:lang w:val="el-GR"/>
+        </w:rPr>
+        <w:t xml:space="preserve">Το ίδιο ισχύει και για τα θέματα </w:t>
+      </w:r>
+      <w:r>
+        <w:rPr>
+          <w:sz w:val="28"/>
+          <w:szCs w:val="28"/>
+          <w:lang w:val="el-GR"/>
+        </w:rPr>
+        <w:t>Πληροφορικής</w:t>
+      </w:r>
+      <w:r>
+        <w:rPr>
+          <w:sz w:val="28"/>
+          <w:szCs w:val="28"/>
+          <w:lang w:val="el-GR"/>
+        </w:rPr>
+        <w:t xml:space="preserve"> </w:t>
+      </w:r>
+      <w:r>
+        <w:rPr>
+          <w:sz w:val="28"/>
+          <w:szCs w:val="28"/>
+          <w:lang w:val="el-GR"/>
+        </w:rPr>
+        <w:t>ΓΕΛ</w:t>
+      </w:r>
+      <w:r>
+        <w:rPr>
+          <w:sz w:val="28"/>
+          <w:szCs w:val="28"/>
+          <w:lang w:val="el-GR"/>
+        </w:rPr>
+        <w:t xml:space="preserve"> 202</w:t>
+      </w:r>
+      <w:r>
+        <w:rPr>
+          <w:sz w:val="28"/>
+          <w:szCs w:val="28"/>
+          <w:lang w:val="el-GR"/>
+        </w:rPr>
+        <w:t>4</w:t>
+      </w:r>
+      <w:r>
+        <w:rPr>
+          <w:sz w:val="28"/>
+          <w:szCs w:val="28"/>
+          <w:lang w:val="el-GR"/>
+        </w:rPr>
+        <w:t xml:space="preserve"> για τ</w:t>
+      </w:r>
+      <w:r>
+        <w:rPr>
+          <w:sz w:val="28"/>
+          <w:szCs w:val="28"/>
+          <w:lang w:val="el-GR"/>
+        </w:rPr>
+        <w:t xml:space="preserve">ην άσκηση </w:t>
+      </w:r>
+      <w:r>
+        <w:rPr>
+          <w:b/>
+          <w:bCs/>
+          <w:sz w:val="28"/>
+          <w:szCs w:val="28"/>
+          <w:lang w:val="el-GR"/>
+        </w:rPr>
+        <w:t>Α3</w:t>
+      </w:r>
+      <w:r>
+        <w:rPr>
+          <w:sz w:val="28"/>
+          <w:szCs w:val="28"/>
+          <w:lang w:val="el-GR"/>
+        </w:rPr>
+        <w:t>. Οι απαντήσεις έχουν αντληθεί από το Φροντιστήριο Πουκαμισάς</w:t>
+      </w:r>
+      <w:r>
+        <w:rPr>
+          <w:sz w:val="28"/>
+          <w:szCs w:val="28"/>
+          <w:lang w:val="el-GR"/>
+        </w:rPr>
+        <w:t xml:space="preserve"> (</w:t>
+      </w:r>
+      <w:hyperlink r:id="rId9" w:history="1">
+        <w:r>
+          <w:rPr>
+            <w:rStyle w:val="Hyperlink"/>
+            <w:sz w:val="28"/>
+            <w:szCs w:val="28"/>
+            <w:lang w:val="el-GR"/>
+          </w:rPr>
+          <w:t>https://www.poukamisas.gr/wp-content/uploads/2024/06/apadiseis-pliroforiki-gel-2024.pdf</w:t>
+        </w:r>
+      </w:hyperlink>
+      <w:r>
+        <w:rPr>
+          <w:sz w:val="28"/>
+          <w:szCs w:val="28"/>
+          <w:lang w:val="el-GR"/>
+        </w:rPr>
+        <w:t xml:space="preserve">) </w:t>
+      </w:r>
+      <w:r>
+        <w:rPr>
+          <w:sz w:val="28"/>
+          <w:szCs w:val="28"/>
+          <w:lang w:val="el-GR"/>
+        </w:rPr>
+        <w:t xml:space="preserve"> </w:t>
       </w:r>
     </w:p>
     <w:p>

</xml_diff>

<commit_message>
Added answers (md files) for 2023 GEL arxaia and mathimatika exam topics.
</commit_message>
<xml_diff>
--- a/ideas/comments.docx
+++ b/ideas/comments.docx
@@ -652,7 +652,23 @@
           <w:szCs w:val="28"/>
           <w:lang w:val="el-GR"/>
         </w:rPr>
-        <w:t xml:space="preserve">Το ίδιο ισχύει και για τα θέματα Μαθηματικών ΓΕΛ 2024 για τις ασκήσεις </w:t>
+        <w:t>Το ίδιο ισχύει και για τα θέματα Μαθηματικών ΓΕΛ 2024</w:t>
+      </w:r>
+      <w:r>
+        <w:rPr>
+          <w:sz w:val="28"/>
+          <w:szCs w:val="28"/>
+          <w:lang w:val="el-GR"/>
+        </w:rPr>
+        <w:t>, 2023</w:t>
+      </w:r>
+      <w:r>
+        <w:rPr>
+          <w:sz w:val="28"/>
+          <w:szCs w:val="28"/>
+          <w:lang w:val="el-GR"/>
+        </w:rPr>
+        <w:t xml:space="preserve"> για τις ασκήσεις </w:t>
       </w:r>
       <w:r>
         <w:rPr>
@@ -711,6 +727,26 @@
       </w:hyperlink>
       <w:r>
         <w:rPr>
+          <w:rStyle w:val="Hyperlink"/>
+          <w:sz w:val="28"/>
+          <w:szCs w:val="28"/>
+          <w:lang w:val="el-GR"/>
+        </w:rPr>
+        <w:t xml:space="preserve">, </w:t>
+      </w:r>
+      <w:hyperlink r:id="rId9" w:history="1">
+        <w:r>
+          <w:rPr>
+            <w:rStyle w:val="Hyperlink"/>
+            <w:sz w:val="28"/>
+            <w:szCs w:val="28"/>
+            <w:lang w:val="el-GR"/>
+          </w:rPr>
+          <w:t>https://drive.google.com/file/d/1fccvaRIqYpwvd8v47YmHjBNZVlE7jGtT/view</w:t>
+        </w:r>
+      </w:hyperlink>
+      <w:r>
+        <w:rPr>
           <w:sz w:val="28"/>
           <w:szCs w:val="28"/>
           <w:lang w:val="el-GR"/>
@@ -738,63 +774,7 @@
           <w:szCs w:val="28"/>
           <w:lang w:val="el-GR"/>
         </w:rPr>
-        <w:t xml:space="preserve">Το ίδιο ισχύει και για τα θέματα </w:t>
-      </w:r>
-      <w:r>
-        <w:rPr>
-          <w:sz w:val="28"/>
-          <w:szCs w:val="28"/>
-          <w:lang w:val="el-GR"/>
-        </w:rPr>
-        <w:t>Πληροφορικής</w:t>
-      </w:r>
-      <w:r>
-        <w:rPr>
-          <w:sz w:val="28"/>
-          <w:szCs w:val="28"/>
-          <w:lang w:val="el-GR"/>
-        </w:rPr>
-        <w:t xml:space="preserve"> </w:t>
-      </w:r>
-      <w:r>
-        <w:rPr>
-          <w:sz w:val="28"/>
-          <w:szCs w:val="28"/>
-          <w:lang w:val="el-GR"/>
-        </w:rPr>
-        <w:t>ΓΕΛ</w:t>
-      </w:r>
-      <w:r>
-        <w:rPr>
-          <w:sz w:val="28"/>
-          <w:szCs w:val="28"/>
-          <w:lang w:val="el-GR"/>
-        </w:rPr>
-        <w:t xml:space="preserve"> 202</w:t>
-      </w:r>
-      <w:r>
-        <w:rPr>
-          <w:sz w:val="28"/>
-          <w:szCs w:val="28"/>
-          <w:lang w:val="el-GR"/>
-        </w:rPr>
-        <w:t>4</w:t>
-      </w:r>
-      <w:r>
-        <w:rPr>
-          <w:sz w:val="28"/>
-          <w:szCs w:val="28"/>
-          <w:lang w:val="el-GR"/>
-        </w:rPr>
-        <w:t xml:space="preserve"> για τ</w:t>
-      </w:r>
-      <w:r>
-        <w:rPr>
-          <w:sz w:val="28"/>
-          <w:szCs w:val="28"/>
-          <w:lang w:val="el-GR"/>
-        </w:rPr>
-        <w:t xml:space="preserve">ην άσκηση </w:t>
+        <w:t xml:space="preserve">Το ίδιο ισχύει και για τα θέματα Πληροφορικής ΓΕΛ 2024 για την άσκηση </w:t>
       </w:r>
       <w:r>
         <w:rPr>
@@ -812,17 +792,9 @@
           <w:szCs w:val="28"/>
           <w:lang w:val="el-GR"/>
         </w:rPr>
-        <w:t>. Οι απαντήσεις έχουν αντληθεί από το Φροντιστήριο Πουκαμισάς</w:t>
-      </w:r>
-      <w:r>
-        <w:rPr>
-          <w:sz w:val="28"/>
-          <w:szCs w:val="28"/>
-          <w:lang w:val="el-GR"/>
-        </w:rPr>
-        <w:t xml:space="preserve"> (</w:t>
-      </w:r>
-      <w:hyperlink r:id="rId9" w:history="1">
+        <w:t>. Οι απαντήσεις έχουν αντληθεί από το Φροντιστήριο Πουκαμισάς (</w:t>
+      </w:r>
+      <w:hyperlink r:id="rId10" w:history="1">
         <w:r>
           <w:rPr>
             <w:rStyle w:val="Hyperlink"/>
@@ -839,15 +811,7 @@
           <w:szCs w:val="28"/>
           <w:lang w:val="el-GR"/>
         </w:rPr>
-        <w:t xml:space="preserve">) </w:t>
-      </w:r>
-      <w:r>
-        <w:rPr>
-          <w:sz w:val="28"/>
-          <w:szCs w:val="28"/>
-          <w:lang w:val="el-GR"/>
-        </w:rPr>
-        <w:t xml:space="preserve"> </w:t>
+        <w:t xml:space="preserve">)  </w:t>
       </w:r>
     </w:p>
     <w:p>

</xml_diff>

<commit_message>
Added json and md files for fysiki and pliroforiki exam topics 2022
</commit_message>
<xml_diff>
--- a/ideas/comments.docx
+++ b/ideas/comments.docx
@@ -1,6 +1,6 @@
 
 <file path=word/document.xml><?xml version="1.0" encoding="utf-8"?>
-<w:document xmlns:wpc="http://schemas.microsoft.com/office/word/2010/wordprocessingCanvas" xmlns:cx="http://schemas.microsoft.com/office/drawing/2014/chartex" xmlns:cx1="http://schemas.microsoft.com/office/drawing/2015/9/8/chartex" xmlns:cx2="http://schemas.microsoft.com/office/drawing/2015/10/21/chartex" xmlns:cx3="http://schemas.microsoft.com/office/drawing/2016/5/9/chartex" xmlns:cx4="http://schemas.microsoft.com/office/drawing/2016/5/10/chartex" xmlns:cx5="http://schemas.microsoft.com/office/drawing/2016/5/11/chartex" xmlns:cx6="http://schemas.microsoft.com/office/drawing/2016/5/12/chartex" xmlns:cx7="http://schemas.microsoft.com/office/drawing/2016/5/13/chartex" xmlns:cx8="http://schemas.microsoft.com/office/drawing/2016/5/14/chartex" xmlns:mc="http://schemas.openxmlformats.org/markup-compatibility/2006" xmlns:aink="http://schemas.microsoft.com/office/drawing/2016/ink" xmlns:am3d="http://schemas.microsoft.com/office/drawing/2017/model3d" xmlns:o="urn:schemas-microsoft-com:office:office" xmlns:oel="http://schemas.microsoft.com/office/2019/extlst" xmlns:r="http://schemas.openxmlformats.org/officeDocument/2006/relationships" xmlns:m="http://schemas.openxmlformats.org/officeDocument/2006/math" xmlns:v="urn:schemas-microsoft-com:vml" xmlns:wp14="http://schemas.microsoft.com/office/word/2010/wordprocessingDrawing" xmlns:wp="http://schemas.openxmlformats.org/drawingml/2006/wordprocessingDrawing" xmlns:w10="urn:schemas-microsoft-com:office:word" xmlns:w="http://schemas.openxmlformats.org/wordprocessingml/2006/main" xmlns:w14="http://schemas.microsoft.com/office/word/2010/wordml" xmlns:w15="http://schemas.microsoft.com/office/word/2012/wordml" xmlns:w16cex="http://schemas.microsoft.com/office/word/2018/wordml/cex" xmlns:w16cid="http://schemas.microsoft.com/office/word/2016/wordml/cid" xmlns:w16="http://schemas.microsoft.com/office/word/2018/wordml" xmlns:w16du="http://schemas.microsoft.com/office/word/2023/wordml/word16du" xmlns:w16sdtdh="http://schemas.microsoft.com/office/word/2020/wordml/sdtdatahash" xmlns:w16sdtfl="http://schemas.microsoft.com/office/word/2024/wordml/sdtformatlock" xmlns:w16se="http://schemas.microsoft.com/office/word/2015/wordml/symex" xmlns:wpg="http://schemas.microsoft.com/office/word/2010/wordprocessingGroup" xmlns:wpi="http://schemas.microsoft.com/office/word/2010/wordprocessingInk" xmlns:wne="http://schemas.microsoft.com/office/word/2006/wordml" xmlns:wps="http://schemas.microsoft.com/office/word/2010/wordprocessingShape" mc:Ignorable="w14 w15 w16se w16cid w16 w16cex w16sdtdh w16sdtfl w16du wp14">
+<w:document xmlns:wpc="http://schemas.microsoft.com/office/word/2010/wordprocessingCanvas" xmlns:cx="http://schemas.microsoft.com/office/drawing/2014/chartex" xmlns:cx1="http://schemas.microsoft.com/office/drawing/2015/9/8/chartex" xmlns:cx2="http://schemas.microsoft.com/office/drawing/2015/10/21/chartex" xmlns:cx3="http://schemas.microsoft.com/office/drawing/2016/5/9/chartex" xmlns:cx4="http://schemas.microsoft.com/office/drawing/2016/5/10/chartex" xmlns:cx5="http://schemas.microsoft.com/office/drawing/2016/5/11/chartex" xmlns:cx6="http://schemas.microsoft.com/office/drawing/2016/5/12/chartex" xmlns:cx7="http://schemas.microsoft.com/office/drawing/2016/5/13/chartex" xmlns:cx8="http://schemas.microsoft.com/office/drawing/2016/5/14/chartex" xmlns:mc="http://schemas.openxmlformats.org/markup-compatibility/2006" xmlns:aink="http://schemas.microsoft.com/office/drawing/2016/ink" xmlns:am3d="http://schemas.microsoft.com/office/drawing/2017/model3d" xmlns:o="urn:schemas-microsoft-com:office:office" xmlns:r="http://schemas.openxmlformats.org/officeDocument/2006/relationships" xmlns:m="http://schemas.openxmlformats.org/officeDocument/2006/math" xmlns:v="urn:schemas-microsoft-com:vml" xmlns:wp14="http://schemas.microsoft.com/office/word/2010/wordprocessingDrawing" xmlns:wp="http://schemas.openxmlformats.org/drawingml/2006/wordprocessingDrawing" xmlns:w10="urn:schemas-microsoft-com:office:word" xmlns:w="http://schemas.openxmlformats.org/wordprocessingml/2006/main" xmlns:w14="http://schemas.microsoft.com/office/word/2010/wordml" xmlns:w15="http://schemas.microsoft.com/office/word/2012/wordml" xmlns:w16cex="http://schemas.microsoft.com/office/word/2018/wordml/cex" xmlns:w16cid="http://schemas.microsoft.com/office/word/2016/wordml/cid" xmlns:w16="http://schemas.microsoft.com/office/word/2018/wordml" xmlns:w16sdtdh="http://schemas.microsoft.com/office/word/2020/wordml/sdtdatahash" xmlns:w16se="http://schemas.microsoft.com/office/word/2015/wordml/symex" xmlns:wpg="http://schemas.microsoft.com/office/word/2010/wordprocessingGroup" xmlns:wpi="http://schemas.microsoft.com/office/word/2010/wordprocessingInk" xmlns:wne="http://schemas.microsoft.com/office/word/2006/wordml" xmlns:wps="http://schemas.microsoft.com/office/word/2010/wordprocessingShape" mc:Ignorable="w14 w15 w16se w16cid w16 w16cex w16sdtdh wp14">
   <w:body>
     <w:p>
       <w:pPr>
@@ -17,7 +17,7 @@
     </w:p>
     <w:p>
       <w:pPr>
-        <w:pStyle w:val="a3"/>
+        <w:pStyle w:val="ListParagraph"/>
         <w:numPr>
           <w:ilvl w:val="0"/>
           <w:numId w:val="1"/>
@@ -35,7 +35,7 @@
     </w:p>
     <w:p>
       <w:pPr>
-        <w:pStyle w:val="a3"/>
+        <w:pStyle w:val="ListParagraph"/>
         <w:numPr>
           <w:ilvl w:val="0"/>
           <w:numId w:val="1"/>
@@ -53,7 +53,7 @@
     </w:p>
     <w:p>
       <w:pPr>
-        <w:pStyle w:val="a3"/>
+        <w:pStyle w:val="ListParagraph"/>
         <w:numPr>
           <w:ilvl w:val="0"/>
           <w:numId w:val="1"/>
@@ -84,7 +84,7 @@
     </w:p>
     <w:p>
       <w:pPr>
-        <w:pStyle w:val="a3"/>
+        <w:pStyle w:val="ListParagraph"/>
         <w:numPr>
           <w:ilvl w:val="0"/>
           <w:numId w:val="1"/>
@@ -102,7 +102,7 @@
     </w:p>
     <w:p>
       <w:pPr>
-        <w:pStyle w:val="a3"/>
+        <w:pStyle w:val="ListParagraph"/>
         <w:numPr>
           <w:ilvl w:val="0"/>
           <w:numId w:val="1"/>
@@ -133,7 +133,7 @@
     </w:p>
     <w:p>
       <w:pPr>
-        <w:pStyle w:val="a3"/>
+        <w:pStyle w:val="ListParagraph"/>
         <w:numPr>
           <w:ilvl w:val="0"/>
           <w:numId w:val="1"/>
@@ -151,7 +151,7 @@
     </w:p>
     <w:p>
       <w:pPr>
-        <w:pStyle w:val="a3"/>
+        <w:pStyle w:val="ListParagraph"/>
         <w:numPr>
           <w:ilvl w:val="0"/>
           <w:numId w:val="1"/>
@@ -169,7 +169,7 @@
     </w:p>
     <w:p>
       <w:pPr>
-        <w:pStyle w:val="a3"/>
+        <w:pStyle w:val="ListParagraph"/>
         <w:numPr>
           <w:ilvl w:val="0"/>
           <w:numId w:val="1"/>
@@ -200,7 +200,7 @@
     </w:p>
     <w:p>
       <w:pPr>
-        <w:pStyle w:val="a3"/>
+        <w:pStyle w:val="ListParagraph"/>
         <w:numPr>
           <w:ilvl w:val="0"/>
           <w:numId w:val="1"/>
@@ -218,7 +218,7 @@
     </w:p>
     <w:p>
       <w:pPr>
-        <w:pStyle w:val="a3"/>
+        <w:pStyle w:val="ListParagraph"/>
         <w:numPr>
           <w:ilvl w:val="0"/>
           <w:numId w:val="1"/>
@@ -236,7 +236,7 @@
     </w:p>
     <w:p>
       <w:pPr>
-        <w:pStyle w:val="a3"/>
+        <w:pStyle w:val="ListParagraph"/>
         <w:numPr>
           <w:ilvl w:val="0"/>
           <w:numId w:val="1"/>
@@ -479,7 +479,7 @@
       <w:hyperlink r:id="rId5" w:history="1">
         <w:r>
           <w:rPr>
-            <w:rStyle w:val="-"/>
+            <w:rStyle w:val="Hyperlink"/>
             <w:sz w:val="28"/>
             <w:szCs w:val="28"/>
             <w:lang w:val="el-GR"/>
@@ -539,7 +539,7 @@
       <w:hyperlink r:id="rId6" w:history="1">
         <w:r>
           <w:rPr>
-            <w:rStyle w:val="-"/>
+            <w:rStyle w:val="Hyperlink"/>
             <w:sz w:val="28"/>
             <w:szCs w:val="28"/>
             <w:lang w:val="el-GR"/>
@@ -599,7 +599,7 @@
       <w:hyperlink r:id="rId7" w:history="1">
         <w:r>
           <w:rPr>
-            <w:rStyle w:val="-"/>
+            <w:rStyle w:val="Hyperlink"/>
             <w:sz w:val="28"/>
             <w:szCs w:val="28"/>
             <w:lang w:val="el-GR"/>
@@ -717,7 +717,7 @@
       <w:hyperlink r:id="rId8" w:history="1">
         <w:r>
           <w:rPr>
-            <w:rStyle w:val="-"/>
+            <w:rStyle w:val="Hyperlink"/>
             <w:sz w:val="28"/>
             <w:szCs w:val="28"/>
             <w:lang w:val="el-GR"/>
@@ -727,7 +727,7 @@
       </w:hyperlink>
       <w:r>
         <w:rPr>
-          <w:rStyle w:val="-"/>
+          <w:rStyle w:val="Hyperlink"/>
           <w:sz w:val="28"/>
           <w:szCs w:val="28"/>
           <w:lang w:val="el-GR"/>
@@ -737,7 +737,7 @@
       <w:hyperlink r:id="rId9" w:history="1">
         <w:r>
           <w:rPr>
-            <w:rStyle w:val="-"/>
+            <w:rStyle w:val="Hyperlink"/>
             <w:sz w:val="28"/>
             <w:szCs w:val="28"/>
             <w:lang w:val="el-GR"/>
@@ -797,7 +797,7 @@
       <w:hyperlink r:id="rId10" w:history="1">
         <w:r>
           <w:rPr>
-            <w:rStyle w:val="-"/>
+            <w:rStyle w:val="Hyperlink"/>
             <w:sz w:val="28"/>
             <w:szCs w:val="28"/>
             <w:lang w:val="el-GR"/>
@@ -986,7 +986,7 @@
               </wp:anchor>
             </w:drawing>
           </mc:Choice>
-          <mc:Fallback>
+          <mc:Fallback xmlns:w16sdtfl="http://schemas.microsoft.com/office/word/2024/wordml/sdtformatlock" xmlns:w16du="http://schemas.microsoft.com/office/word/2023/wordml/word16du" xmlns:oel="http://schemas.microsoft.com/office/2019/extlst">
             <w:pict>
               <v:shapetype w14:anchorId="1ED75128" id="_x0000_t65" coordsize="21600,21600" o:spt="65" adj="18900" path="m,l,21600@0,21600,21600@0,21600,xem@0,21600nfl@3@5c@7@9@11@13,21600@0e">
                 <v:formulas>
@@ -1112,7 +1112,6 @@
         </w:rPr>
         <w:t xml:space="preserve">α, β, γ, </w:t>
       </w:r>
-      <w:proofErr w:type="spellStart"/>
       <w:r>
         <w:rPr>
           <w:sz w:val="28"/>
@@ -1120,7 +1119,6 @@
         </w:rPr>
         <w:t>i</w:t>
       </w:r>
-      <w:proofErr w:type="spellEnd"/>
       <w:r>
         <w:rPr>
           <w:sz w:val="28"/>
@@ -1144,23 +1142,13 @@
         </w:rPr>
         <w:t xml:space="preserve"> </w:t>
       </w:r>
-      <w:proofErr w:type="spellStart"/>
-      <w:r>
-        <w:rPr>
-          <w:sz w:val="28"/>
-          <w:szCs w:val="28"/>
-          <w:lang w:val="el-GR"/>
-        </w:rPr>
-        <w:t>κλπ</w:t>
-      </w:r>
-      <w:proofErr w:type="spellEnd"/>
-      <w:r>
-        <w:rPr>
-          <w:sz w:val="28"/>
-          <w:szCs w:val="28"/>
-          <w:lang w:val="el-GR"/>
-        </w:rPr>
-        <w:t xml:space="preserve">) έχουν ενσωματωθεί στο </w:t>
+      <w:r>
+        <w:rPr>
+          <w:sz w:val="28"/>
+          <w:szCs w:val="28"/>
+          <w:lang w:val="el-GR"/>
+        </w:rPr>
+        <w:t xml:space="preserve">κλπ) έχουν ενσωματωθεί στο </w:t>
       </w:r>
       <w:r>
         <w:rPr>
@@ -1339,6 +1327,105 @@
           <w:lang w:val="el-GR"/>
         </w:rPr>
         <w:t xml:space="preserve">Σε θέμα της Οικονομίας 2025, ζητείται ως απάντηση η δημιουργία πίνακα. Σε αυτή την περίπτωση τι κάνουμε; </w:t>
+      </w:r>
+    </w:p>
+    <w:p>
+      <w:pPr>
+        <w:pStyle w:val="Default"/>
+        <w:numPr>
+          <w:ilvl w:val="0"/>
+          <w:numId w:val="2"/>
+        </w:numPr>
+        <w:jc w:val="both"/>
+        <w:rPr>
+          <w:sz w:val="28"/>
+          <w:szCs w:val="28"/>
+          <w:lang w:val="el-GR"/>
+        </w:rPr>
+      </w:pPr>
+      <w:r>
+        <w:rPr>
+          <w:sz w:val="28"/>
+          <w:szCs w:val="28"/>
+          <w:lang w:val="el-GR"/>
+        </w:rPr>
+        <w:t xml:space="preserve">Η απάντηση στο θέμα Α2.β και στο Β2.α στα θέματα Πληροφορικής ΓΕΛ 2022 είναι σχήματα. Βάλαμε το </w:t>
+      </w:r>
+      <w:r>
+        <w:rPr>
+          <w:sz w:val="28"/>
+          <w:szCs w:val="28"/>
+        </w:rPr>
+        <w:t>llm</w:t>
+      </w:r>
+      <w:r>
+        <w:rPr>
+          <w:sz w:val="28"/>
+          <w:szCs w:val="28"/>
+          <w:lang w:val="el-GR"/>
+        </w:rPr>
+        <w:t xml:space="preserve"> </w:t>
+      </w:r>
+      <w:r>
+        <w:rPr>
+          <w:sz w:val="28"/>
+          <w:szCs w:val="28"/>
+          <w:lang w:val="el-GR"/>
+        </w:rPr>
+        <w:t xml:space="preserve">να περιγράψει την εικόνα ώστε να έχουμε την σωστή απάντηση ως </w:t>
+      </w:r>
+      <w:r>
+        <w:rPr>
+          <w:sz w:val="28"/>
+          <w:szCs w:val="28"/>
+        </w:rPr>
+        <w:t>string</w:t>
+      </w:r>
+      <w:r>
+        <w:rPr>
+          <w:sz w:val="28"/>
+          <w:szCs w:val="28"/>
+          <w:lang w:val="el-GR"/>
+        </w:rPr>
+        <w:t xml:space="preserve"> </w:t>
+      </w:r>
+      <w:r>
+        <w:rPr>
+          <w:sz w:val="28"/>
+          <w:szCs w:val="28"/>
+          <w:lang w:val="el-GR"/>
+        </w:rPr>
+        <w:t xml:space="preserve">στο </w:t>
+      </w:r>
+      <w:r>
+        <w:rPr>
+          <w:sz w:val="28"/>
+          <w:szCs w:val="28"/>
+        </w:rPr>
+        <w:t>md</w:t>
+      </w:r>
+      <w:r>
+        <w:rPr>
+          <w:sz w:val="28"/>
+          <w:szCs w:val="28"/>
+          <w:lang w:val="el-GR"/>
+        </w:rPr>
+        <w:t xml:space="preserve"> </w:t>
+      </w:r>
+      <w:r>
+        <w:rPr>
+          <w:sz w:val="28"/>
+          <w:szCs w:val="28"/>
+        </w:rPr>
+        <w:t>file</w:t>
+      </w:r>
+      <w:r>
+        <w:rPr>
+          <w:sz w:val="28"/>
+          <w:szCs w:val="28"/>
+          <w:lang w:val="el-GR"/>
+        </w:rPr>
+        <w:t>.</w:t>
       </w:r>
     </w:p>
     <w:sectPr>
@@ -1352,7 +1439,7 @@
 </file>
 
 <file path=word/numbering.xml><?xml version="1.0" encoding="utf-8"?>
-<w:numbering xmlns:wpc="http://schemas.microsoft.com/office/word/2010/wordprocessingCanvas" xmlns:cx="http://schemas.microsoft.com/office/drawing/2014/chartex" xmlns:cx1="http://schemas.microsoft.com/office/drawing/2015/9/8/chartex" xmlns:cx2="http://schemas.microsoft.com/office/drawing/2015/10/21/chartex" xmlns:cx3="http://schemas.microsoft.com/office/drawing/2016/5/9/chartex" xmlns:cx4="http://schemas.microsoft.com/office/drawing/2016/5/10/chartex" xmlns:cx5="http://schemas.microsoft.com/office/drawing/2016/5/11/chartex" xmlns:cx6="http://schemas.microsoft.com/office/drawing/2016/5/12/chartex" xmlns:cx7="http://schemas.microsoft.com/office/drawing/2016/5/13/chartex" xmlns:cx8="http://schemas.microsoft.com/office/drawing/2016/5/14/chartex" xmlns:mc="http://schemas.openxmlformats.org/markup-compatibility/2006" xmlns:aink="http://schemas.microsoft.com/office/drawing/2016/ink" xmlns:am3d="http://schemas.microsoft.com/office/drawing/2017/model3d" xmlns:o="urn:schemas-microsoft-com:office:office" xmlns:oel="http://schemas.microsoft.com/office/2019/extlst" xmlns:r="http://schemas.openxmlformats.org/officeDocument/2006/relationships" xmlns:m="http://schemas.openxmlformats.org/officeDocument/2006/math" xmlns:v="urn:schemas-microsoft-com:vml" xmlns:wp14="http://schemas.microsoft.com/office/word/2010/wordprocessingDrawing" xmlns:wp="http://schemas.openxmlformats.org/drawingml/2006/wordprocessingDrawing" xmlns:w10="urn:schemas-microsoft-com:office:word" xmlns:w="http://schemas.openxmlformats.org/wordprocessingml/2006/main" xmlns:w14="http://schemas.microsoft.com/office/word/2010/wordml" xmlns:w15="http://schemas.microsoft.com/office/word/2012/wordml" xmlns:w16cex="http://schemas.microsoft.com/office/word/2018/wordml/cex" xmlns:w16cid="http://schemas.microsoft.com/office/word/2016/wordml/cid" xmlns:w16="http://schemas.microsoft.com/office/word/2018/wordml" xmlns:w16du="http://schemas.microsoft.com/office/word/2023/wordml/word16du" xmlns:w16sdtdh="http://schemas.microsoft.com/office/word/2020/wordml/sdtdatahash" xmlns:w16sdtfl="http://schemas.microsoft.com/office/word/2024/wordml/sdtformatlock" xmlns:w16se="http://schemas.microsoft.com/office/word/2015/wordml/symex" xmlns:wpg="http://schemas.microsoft.com/office/word/2010/wordprocessingGroup" xmlns:wpi="http://schemas.microsoft.com/office/word/2010/wordprocessingInk" xmlns:wne="http://schemas.microsoft.com/office/word/2006/wordml" xmlns:wps="http://schemas.microsoft.com/office/word/2010/wordprocessingShape" mc:Ignorable="w14 w15 w16se w16cid w16 w16cex w16sdtdh w16sdtfl w16du wp14">
+<w:numbering xmlns:wpc="http://schemas.microsoft.com/office/word/2010/wordprocessingCanvas" xmlns:cx="http://schemas.microsoft.com/office/drawing/2014/chartex" xmlns:cx1="http://schemas.microsoft.com/office/drawing/2015/9/8/chartex" xmlns:cx2="http://schemas.microsoft.com/office/drawing/2015/10/21/chartex" xmlns:cx3="http://schemas.microsoft.com/office/drawing/2016/5/9/chartex" xmlns:cx4="http://schemas.microsoft.com/office/drawing/2016/5/10/chartex" xmlns:cx5="http://schemas.microsoft.com/office/drawing/2016/5/11/chartex" xmlns:cx6="http://schemas.microsoft.com/office/drawing/2016/5/12/chartex" xmlns:cx7="http://schemas.microsoft.com/office/drawing/2016/5/13/chartex" xmlns:cx8="http://schemas.microsoft.com/office/drawing/2016/5/14/chartex" xmlns:mc="http://schemas.openxmlformats.org/markup-compatibility/2006" xmlns:aink="http://schemas.microsoft.com/office/drawing/2016/ink" xmlns:am3d="http://schemas.microsoft.com/office/drawing/2017/model3d" xmlns:o="urn:schemas-microsoft-com:office:office" xmlns:r="http://schemas.openxmlformats.org/officeDocument/2006/relationships" xmlns:m="http://schemas.openxmlformats.org/officeDocument/2006/math" xmlns:v="urn:schemas-microsoft-com:vml" xmlns:wp14="http://schemas.microsoft.com/office/word/2010/wordprocessingDrawing" xmlns:wp="http://schemas.openxmlformats.org/drawingml/2006/wordprocessingDrawing" xmlns:w10="urn:schemas-microsoft-com:office:word" xmlns:w="http://schemas.openxmlformats.org/wordprocessingml/2006/main" xmlns:w14="http://schemas.microsoft.com/office/word/2010/wordml" xmlns:w15="http://schemas.microsoft.com/office/word/2012/wordml" xmlns:w16cex="http://schemas.microsoft.com/office/word/2018/wordml/cex" xmlns:w16cid="http://schemas.microsoft.com/office/word/2016/wordml/cid" xmlns:w16="http://schemas.microsoft.com/office/word/2018/wordml" xmlns:w16sdtdh="http://schemas.microsoft.com/office/word/2020/wordml/sdtdatahash" xmlns:w16se="http://schemas.microsoft.com/office/word/2015/wordml/symex" xmlns:wpg="http://schemas.microsoft.com/office/word/2010/wordprocessingGroup" xmlns:wpi="http://schemas.microsoft.com/office/word/2010/wordprocessingInk" xmlns:wne="http://schemas.microsoft.com/office/word/2006/wordml" xmlns:wps="http://schemas.microsoft.com/office/word/2010/wordprocessingShape" mc:Ignorable="w14 w15 w16se w16cid w16 w16cex w16sdtdh wp14">
   <w:abstractNum w:abstractNumId="0" w15:restartNumberingAfterBreak="0">
     <w:nsid w:val="4DB43FAD"/>
     <w:multiLevelType w:val="hybridMultilevel"/>
@@ -1578,17 +1665,17 @@
       </w:rPr>
     </w:lvl>
   </w:abstractNum>
-  <w:num w:numId="1" w16cid:durableId="1911845144">
+  <w:num w:numId="1">
     <w:abstractNumId w:val="0"/>
   </w:num>
-  <w:num w:numId="2" w16cid:durableId="1801222707">
+  <w:num w:numId="2">
     <w:abstractNumId w:val="1"/>
   </w:num>
 </w:numbering>
 </file>
 
 <file path=word/styles.xml><?xml version="1.0" encoding="utf-8"?>
-<w:styles xmlns:mc="http://schemas.openxmlformats.org/markup-compatibility/2006" xmlns:r="http://schemas.openxmlformats.org/officeDocument/2006/relationships" xmlns:w="http://schemas.openxmlformats.org/wordprocessingml/2006/main" xmlns:w14="http://schemas.microsoft.com/office/word/2010/wordml" xmlns:w15="http://schemas.microsoft.com/office/word/2012/wordml" xmlns:w16cex="http://schemas.microsoft.com/office/word/2018/wordml/cex" xmlns:w16cid="http://schemas.microsoft.com/office/word/2016/wordml/cid" xmlns:w16="http://schemas.microsoft.com/office/word/2018/wordml" xmlns:w16du="http://schemas.microsoft.com/office/word/2023/wordml/word16du" xmlns:w16sdtdh="http://schemas.microsoft.com/office/word/2020/wordml/sdtdatahash" xmlns:w16sdtfl="http://schemas.microsoft.com/office/word/2024/wordml/sdtformatlock" xmlns:w16se="http://schemas.microsoft.com/office/word/2015/wordml/symex" mc:Ignorable="w14 w15 w16se w16cid w16 w16cex w16sdtdh w16sdtfl w16du">
+<w:styles xmlns:mc="http://schemas.openxmlformats.org/markup-compatibility/2006" xmlns:r="http://schemas.openxmlformats.org/officeDocument/2006/relationships" xmlns:w="http://schemas.openxmlformats.org/wordprocessingml/2006/main" xmlns:w14="http://schemas.microsoft.com/office/word/2010/wordml" xmlns:w15="http://schemas.microsoft.com/office/word/2012/wordml" xmlns:w16cex="http://schemas.microsoft.com/office/word/2018/wordml/cex" xmlns:w16cid="http://schemas.microsoft.com/office/word/2016/wordml/cid" xmlns:w16="http://schemas.microsoft.com/office/word/2018/wordml" xmlns:w16sdtdh="http://schemas.microsoft.com/office/word/2020/wordml/sdtdatahash" xmlns:w16se="http://schemas.microsoft.com/office/word/2015/wordml/symex" mc:Ignorable="w14 w15 w16se w16cid w16 w16cex w16sdtdh">
   <w:docDefaults>
     <w:rPrDefault>
       <w:rPr>
@@ -1982,17 +2069,17 @@
     <w:lsdException w:name="Unresolved Mention" w:semiHidden="1" w:unhideWhenUsed="1"/>
     <w:lsdException w:name="Smart Link" w:semiHidden="1" w:unhideWhenUsed="1"/>
   </w:latentStyles>
-  <w:style w:type="paragraph" w:default="1" w:styleId="a">
+  <w:style w:type="paragraph" w:default="1" w:styleId="Normal">
     <w:name w:val="Normal"/>
     <w:qFormat/>
   </w:style>
-  <w:style w:type="character" w:default="1" w:styleId="a0">
+  <w:style w:type="character" w:default="1" w:styleId="DefaultParagraphFont">
     <w:name w:val="Default Paragraph Font"/>
     <w:uiPriority w:val="1"/>
     <w:semiHidden/>
     <w:unhideWhenUsed/>
   </w:style>
-  <w:style w:type="table" w:default="1" w:styleId="a1">
+  <w:style w:type="table" w:default="1" w:styleId="TableNormal">
     <w:name w:val="Normal Table"/>
     <w:uiPriority w:val="99"/>
     <w:semiHidden/>
@@ -2007,15 +2094,15 @@
       </w:tblCellMar>
     </w:tblPr>
   </w:style>
-  <w:style w:type="numbering" w:default="1" w:styleId="a2">
+  <w:style w:type="numbering" w:default="1" w:styleId="NoList">
     <w:name w:val="No List"/>
     <w:uiPriority w:val="99"/>
     <w:semiHidden/>
     <w:unhideWhenUsed/>
   </w:style>
-  <w:style w:type="paragraph" w:styleId="a3">
+  <w:style w:type="paragraph" w:styleId="ListParagraph">
     <w:name w:val="List Paragraph"/>
-    <w:basedOn w:val="a"/>
+    <w:basedOn w:val="Normal"/>
     <w:uiPriority w:val="34"/>
     <w:qFormat/>
     <w:rsid w:val="0053357F"/>
@@ -2040,9 +2127,9 @@
       <w:szCs w:val="24"/>
     </w:rPr>
   </w:style>
-  <w:style w:type="character" w:styleId="-">
+  <w:style w:type="character" w:styleId="Hyperlink">
     <w:name w:val="Hyperlink"/>
-    <w:basedOn w:val="a0"/>
+    <w:basedOn w:val="DefaultParagraphFont"/>
     <w:uiPriority w:val="99"/>
     <w:unhideWhenUsed/>
     <w:rsid w:val="004E2BDC"/>
@@ -2051,9 +2138,9 @@
       <w:u w:val="single"/>
     </w:rPr>
   </w:style>
-  <w:style w:type="character" w:styleId="a4">
+  <w:style w:type="character" w:styleId="UnresolvedMention">
     <w:name w:val="Unresolved Mention"/>
-    <w:basedOn w:val="a0"/>
+    <w:basedOn w:val="DefaultParagraphFont"/>
     <w:uiPriority w:val="99"/>
     <w:semiHidden/>
     <w:unhideWhenUsed/>

</xml_diff>

<commit_message>
Added 2020 arxaia json and md files
</commit_message>
<xml_diff>
--- a/ideas/comments.docx
+++ b/ideas/comments.docx
@@ -986,7 +986,7 @@
               </wp:anchor>
             </w:drawing>
           </mc:Choice>
-          <mc:Fallback xmlns:w16sdtfl="http://schemas.microsoft.com/office/word/2024/wordml/sdtformatlock" xmlns:w16du="http://schemas.microsoft.com/office/word/2023/wordml/word16du" xmlns:oel="http://schemas.microsoft.com/office/2019/extlst">
+          <mc:Fallback xmlns:oel="http://schemas.microsoft.com/office/2019/extlst" xmlns:w16du="http://schemas.microsoft.com/office/word/2023/wordml/word16du" xmlns:w16sdtfl="http://schemas.microsoft.com/office/word/2024/wordml/sdtformatlock">
             <w:pict>
               <v:shapetype w14:anchorId="1ED75128" id="_x0000_t65" coordsize="21600,21600" o:spt="65" adj="18900" path="m,l,21600@0,21600,21600@0,21600,xem@0,21600nfl@3@5c@7@9@11@13,21600@0e">
                 <v:formulas>
@@ -1426,6 +1426,30 @@
           <w:lang w:val="el-GR"/>
         </w:rPr>
         <w:t>.</w:t>
+      </w:r>
+    </w:p>
+    <w:p>
+      <w:pPr>
+        <w:pStyle w:val="Default"/>
+        <w:numPr>
+          <w:ilvl w:val="0"/>
+          <w:numId w:val="2"/>
+        </w:numPr>
+        <w:jc w:val="both"/>
+        <w:rPr>
+          <w:sz w:val="28"/>
+          <w:szCs w:val="28"/>
+          <w:lang w:val="el-GR"/>
+        </w:rPr>
+      </w:pPr>
+      <w:r>
+        <w:rPr>
+          <w:sz w:val="28"/>
+          <w:szCs w:val="28"/>
+          <w:lang w:val="el-GR"/>
+        </w:rPr>
+        <w:lastRenderedPageBreak/>
+        <w:t>Τα θέματα και οι απαντήσεις των Μαθηματικών ΓΕΛ 2020 (Νέο Σύστημα) προέρχονται από το φροντιστήριο Πουκαμισάς καθώς δεν υπήρχαν στο σάιτ του ΟΕΦΕ (υπήρχαν μόνο του παλαιού συστήματος)</w:t>
       </w:r>
     </w:p>
     <w:sectPr>

</xml_diff>